<commit_message>
Pour les titres dans les appendix
</commit_message>
<xml_diff>
--- a/output/regv2proxy_appendix.docx
+++ b/output/regv2proxy_appendix.docx
@@ -7,14 +7,22 @@
         <w:tblStyle w:val="TableGrid"/>
       </w:tblPr>
       <w:tblGrid>
-        <w:gridCol w:w="3120"/>
-        <w:gridCol w:w="3120"/>
-        <w:gridCol w:w="3120"/>
+        <w:gridCol w:w="850"/>
+        <w:gridCol w:w="850"/>
+        <w:gridCol w:w="850"/>
+        <w:gridCol w:w="850"/>
+        <w:gridCol w:w="850"/>
+        <w:gridCol w:w="850"/>
+        <w:gridCol w:w="850"/>
+        <w:gridCol w:w="850"/>
+        <w:gridCol w:w="850"/>
+        <w:gridCol w:w="850"/>
+        <w:gridCol w:w="850"/>
       </w:tblGrid>
       <w:tr>
         <w:tc>
           <w:tcPr>
-            <w:tcW w:w="3120" w:type="dxa"/>
+            <w:tcW w:w="850" w:type="dxa"/>
             <w:tcBorders>
               <w:top w:val="single" w:color="000000"/>
               <w:left w:val="nil" w:color="000000"/>
@@ -30,7 +38,7 @@
         </w:tc>
         <w:tc>
           <w:tcPr>
-            <w:tcW w:w="3120" w:type="dxa"/>
+            <w:tcW w:w="850" w:type="dxa"/>
             <w:tcBorders>
               <w:top w:val="single" w:color="000000"/>
               <w:left w:val="single" w:color="000000"/>
@@ -51,7 +59,175 @@
         </w:tc>
         <w:tc>
           <w:tcPr>
-            <w:tcW w:w="3120" w:type="dxa"/>
+            <w:tcW w:w="850" w:type="dxa"/>
+            <w:tcBorders>
+              <w:top w:val="single" w:color="000000"/>
+              <w:left w:val="nil" w:color="000000"/>
+              <w:bottom w:val="nil" w:color="000000"/>
+              <w:right w:val="nil" w:color="000000"/>
+            </w:tcBorders>
+            <w:vAlign w:val="bottom"/>
+          </w:tcPr>
+          <w:p>
+            <w:pPr>
+              <w:spacing w:after="0"/>
+              <w:jc w:val="right"/>
+            </w:pPr>
+            <w:r>
+              <w:t xml:space="preserve">1</w:t>
+            </w:r>
+          </w:p>
+        </w:tc>
+        <w:tc>
+          <w:tcPr>
+            <w:tcW w:w="850" w:type="dxa"/>
+            <w:tcBorders>
+              <w:top w:val="single" w:color="000000"/>
+              <w:left w:val="nil" w:color="000000"/>
+              <w:bottom w:val="nil" w:color="000000"/>
+              <w:right w:val="nil" w:color="000000"/>
+            </w:tcBorders>
+            <w:vAlign w:val="bottom"/>
+          </w:tcPr>
+          <w:p>
+            <w:pPr>
+              <w:spacing w:after="0"/>
+              <w:jc w:val="right"/>
+            </w:pPr>
+            <w:r>
+              <w:t xml:space="preserve">1</w:t>
+            </w:r>
+          </w:p>
+        </w:tc>
+        <w:tc>
+          <w:tcPr>
+            <w:tcW w:w="850" w:type="dxa"/>
+            <w:tcBorders>
+              <w:top w:val="single" w:color="000000"/>
+              <w:left w:val="nil" w:color="000000"/>
+              <w:bottom w:val="nil" w:color="000000"/>
+              <w:right w:val="nil" w:color="000000"/>
+            </w:tcBorders>
+            <w:vAlign w:val="bottom"/>
+          </w:tcPr>
+          <w:p>
+            <w:pPr>
+              <w:spacing w:after="0"/>
+              <w:jc w:val="right"/>
+            </w:pPr>
+            <w:r>
+              <w:t xml:space="preserve">1</w:t>
+            </w:r>
+          </w:p>
+        </w:tc>
+        <w:tc>
+          <w:tcPr>
+            <w:tcW w:w="850" w:type="dxa"/>
+            <w:tcBorders>
+              <w:top w:val="single" w:color="000000"/>
+              <w:left w:val="nil" w:color="000000"/>
+              <w:bottom w:val="nil" w:color="000000"/>
+              <w:right w:val="nil" w:color="000000"/>
+            </w:tcBorders>
+            <w:vAlign w:val="bottom"/>
+          </w:tcPr>
+          <w:p>
+            <w:pPr>
+              <w:spacing w:after="0"/>
+              <w:jc w:val="right"/>
+            </w:pPr>
+            <w:r>
+              <w:t xml:space="preserve">1</w:t>
+            </w:r>
+          </w:p>
+        </w:tc>
+        <w:tc>
+          <w:tcPr>
+            <w:tcW w:w="850" w:type="dxa"/>
+            <w:tcBorders>
+              <w:top w:val="single" w:color="000000"/>
+              <w:left w:val="nil" w:color="000000"/>
+              <w:bottom w:val="nil" w:color="000000"/>
+              <w:right w:val="nil" w:color="000000"/>
+            </w:tcBorders>
+            <w:vAlign w:val="bottom"/>
+          </w:tcPr>
+          <w:p>
+            <w:pPr>
+              <w:spacing w:after="0"/>
+              <w:jc w:val="right"/>
+            </w:pPr>
+            <w:r>
+              <w:t xml:space="preserve">1</w:t>
+            </w:r>
+          </w:p>
+        </w:tc>
+        <w:tc>
+          <w:tcPr>
+            <w:tcW w:w="850" w:type="dxa"/>
+            <w:tcBorders>
+              <w:top w:val="single" w:color="000000"/>
+              <w:left w:val="nil" w:color="000000"/>
+              <w:bottom w:val="nil" w:color="000000"/>
+              <w:right w:val="nil" w:color="000000"/>
+            </w:tcBorders>
+            <w:vAlign w:val="bottom"/>
+          </w:tcPr>
+          <w:p>
+            <w:pPr>
+              <w:spacing w:after="0"/>
+              <w:jc w:val="right"/>
+            </w:pPr>
+            <w:r>
+              <w:t xml:space="preserve">1</w:t>
+            </w:r>
+          </w:p>
+        </w:tc>
+        <w:tc>
+          <w:tcPr>
+            <w:tcW w:w="850" w:type="dxa"/>
+            <w:tcBorders>
+              <w:top w:val="single" w:color="000000"/>
+              <w:left w:val="nil" w:color="000000"/>
+              <w:bottom w:val="nil" w:color="000000"/>
+              <w:right w:val="nil" w:color="000000"/>
+            </w:tcBorders>
+            <w:vAlign w:val="bottom"/>
+          </w:tcPr>
+          <w:p>
+            <w:pPr>
+              <w:spacing w:after="0"/>
+              <w:jc w:val="right"/>
+            </w:pPr>
+            <w:r>
+              <w:t xml:space="preserve">1</w:t>
+            </w:r>
+          </w:p>
+        </w:tc>
+        <w:tc>
+          <w:tcPr>
+            <w:tcW w:w="850" w:type="dxa"/>
+            <w:tcBorders>
+              <w:top w:val="single" w:color="000000"/>
+              <w:left w:val="nil" w:color="000000"/>
+              <w:bottom w:val="nil" w:color="000000"/>
+              <w:right w:val="nil" w:color="000000"/>
+            </w:tcBorders>
+            <w:vAlign w:val="bottom"/>
+          </w:tcPr>
+          <w:p>
+            <w:pPr>
+              <w:spacing w:after="0"/>
+              <w:jc w:val="right"/>
+            </w:pPr>
+            <w:r>
+              <w:t xml:space="preserve">1</w:t>
+            </w:r>
+          </w:p>
+        </w:tc>
+        <w:tc>
+          <w:tcPr>
+            <w:tcW w:w="850" w:type="dxa"/>
             <w:tcBorders>
               <w:top w:val="single" w:color="000000"/>
               <w:left w:val="nil" w:color="000000"/>
@@ -74,7 +250,7 @@
       <w:tr>
         <w:tc>
           <w:tcPr>
-            <w:tcW w:w="3120" w:type="dxa"/>
+            <w:tcW w:w="850" w:type="dxa"/>
             <w:tcBorders>
               <w:top w:val="nil" w:color="000000"/>
               <w:left w:val="nil" w:color="000000"/>
@@ -90,7 +266,7 @@
         </w:tc>
         <w:tc>
           <w:tcPr>
-            <w:tcW w:w="3120" w:type="dxa"/>
+            <w:tcW w:w="850" w:type="dxa"/>
             <w:tcBorders>
               <w:top w:val="nil" w:color="000000"/>
               <w:left w:val="single" w:color="000000"/>
@@ -105,13 +281,13 @@
               <w:jc w:val="right"/>
             </w:pPr>
             <w:r>
-              <w:t xml:space="preserve">.</w:t>
-            </w:r>
-          </w:p>
-        </w:tc>
-        <w:tc>
-          <w:tcPr>
-            <w:tcW w:w="3120" w:type="dxa"/>
+              <w:t xml:space="preserve">Baseline</w:t>
+            </w:r>
+          </w:p>
+        </w:tc>
+        <w:tc>
+          <w:tcPr>
+            <w:tcW w:w="850" w:type="dxa"/>
             <w:tcBorders>
               <w:top w:val="nil" w:color="000000"/>
               <w:left w:val="nil" w:color="000000"/>
@@ -126,7 +302,175 @@
               <w:jc w:val="right"/>
             </w:pPr>
             <w:r>
-              <w:t xml:space="preserve">OR._VSDO1_VSDR1_VSDT0_VSRV1_VSRT0_INV1_INT0</w:t>
+              <w:t xml:space="preserve">Observations with outstanding claims excluded from analysis</w:t>
+            </w:r>
+          </w:p>
+        </w:tc>
+        <w:tc>
+          <w:tcPr>
+            <w:tcW w:w="850" w:type="dxa"/>
+            <w:tcBorders>
+              <w:top w:val="nil" w:color="000000"/>
+              <w:left w:val="nil" w:color="000000"/>
+              <w:bottom w:val="single" w:color="000000"/>
+              <w:right w:val="nil" w:color="000000"/>
+            </w:tcBorders>
+            <w:vAlign w:val="bottom"/>
+          </w:tcPr>
+          <w:p>
+            <w:pPr>
+              <w:spacing w:after="0"/>
+              <w:jc w:val="right"/>
+            </w:pPr>
+            <w:r>
+              <w:t xml:space="preserve">Claims outstanding assumed to not have been paid at all</w:t>
+            </w:r>
+          </w:p>
+        </w:tc>
+        <w:tc>
+          <w:tcPr>
+            <w:tcW w:w="850" w:type="dxa"/>
+            <w:tcBorders>
+              <w:top w:val="nil" w:color="000000"/>
+              <w:left w:val="nil" w:color="000000"/>
+              <w:bottom w:val="single" w:color="000000"/>
+              <w:right w:val="nil" w:color="000000"/>
+            </w:tcBorders>
+            <w:vAlign w:val="bottom"/>
+          </w:tcPr>
+          <w:p>
+            <w:pPr>
+              <w:spacing w:after="0"/>
+              <w:jc w:val="right"/>
+            </w:pPr>
+            <w:r>
+              <w:t xml:space="preserve">Claims outstanding assumed to have been paid in full</w:t>
+            </w:r>
+          </w:p>
+        </w:tc>
+        <w:tc>
+          <w:tcPr>
+            <w:tcW w:w="850" w:type="dxa"/>
+            <w:tcBorders>
+              <w:top w:val="nil" w:color="000000"/>
+              <w:left w:val="nil" w:color="000000"/>
+              <w:bottom w:val="single" w:color="000000"/>
+              <w:right w:val="nil" w:color="000000"/>
+            </w:tcBorders>
+            <w:vAlign w:val="bottom"/>
+          </w:tcPr>
+          <w:p>
+            <w:pPr>
+              <w:spacing w:after="0"/>
+              <w:jc w:val="right"/>
+            </w:pPr>
+            <w:r>
+              <w:t xml:space="preserve">Higher cost of hull relative to other outlays (25% instead of 17% in baseline)</w:t>
+            </w:r>
+          </w:p>
+        </w:tc>
+        <w:tc>
+          <w:tcPr>
+            <w:tcW w:w="850" w:type="dxa"/>
+            <w:tcBorders>
+              <w:top w:val="nil" w:color="000000"/>
+              <w:left w:val="nil" w:color="000000"/>
+              <w:bottom w:val="single" w:color="000000"/>
+              <w:right w:val="nil" w:color="000000"/>
+            </w:tcBorders>
+            <w:vAlign w:val="bottom"/>
+          </w:tcPr>
+          <w:p>
+            <w:pPr>
+              <w:spacing w:after="0"/>
+              <w:jc w:val="right"/>
+            </w:pPr>
+            <w:r>
+              <w:t xml:space="preserve">Lower rate of depreciation (10% instead of baseline 25%)</w:t>
+            </w:r>
+          </w:p>
+        </w:tc>
+        <w:tc>
+          <w:tcPr>
+            <w:tcW w:w="850" w:type="dxa"/>
+            <w:tcBorders>
+              <w:top w:val="nil" w:color="000000"/>
+              <w:left w:val="nil" w:color="000000"/>
+              <w:bottom w:val="single" w:color="000000"/>
+              <w:right w:val="nil" w:color="000000"/>
+            </w:tcBorders>
+            <w:vAlign w:val="bottom"/>
+          </w:tcPr>
+          <w:p>
+            <w:pPr>
+              <w:spacing w:after="0"/>
+              <w:jc w:val="right"/>
+            </w:pPr>
+            <w:r>
+              <w:t xml:space="preserve">Cost of insurance not added to any voyages</w:t>
+            </w:r>
+          </w:p>
+        </w:tc>
+        <w:tc>
+          <w:tcPr>
+            <w:tcW w:w="850" w:type="dxa"/>
+            <w:tcBorders>
+              <w:top w:val="nil" w:color="000000"/>
+              <w:left w:val="nil" w:color="000000"/>
+              <w:bottom w:val="single" w:color="000000"/>
+              <w:right w:val="nil" w:color="000000"/>
+            </w:tcBorders>
+            <w:vAlign w:val="bottom"/>
+          </w:tcPr>
+          <w:p>
+            <w:pPr>
+              <w:spacing w:after="0"/>
+              <w:jc w:val="right"/>
+            </w:pPr>
+            <w:r>
+              <w:t xml:space="preserve">Cost of insurance added to outlays, even in cases where accounts seem to suggest total outlays</w:t>
+            </w:r>
+          </w:p>
+        </w:tc>
+        <w:tc>
+          <w:tcPr>
+            <w:tcW w:w="850" w:type="dxa"/>
+            <w:tcBorders>
+              <w:top w:val="nil" w:color="000000"/>
+              <w:left w:val="nil" w:color="000000"/>
+              <w:bottom w:val="single" w:color="000000"/>
+              <w:right w:val="nil" w:color="000000"/>
+            </w:tcBorders>
+            <w:vAlign w:val="bottom"/>
+          </w:tcPr>
+          <w:p>
+            <w:pPr>
+              <w:spacing w:after="0"/>
+              <w:jc w:val="right"/>
+            </w:pPr>
+            <w:r>
+              <w:t xml:space="preserve">Value of hull (outgoing/incoming) added to outlays/returns, even in cases where accounts seem to suggest total outlays/returns</w:t>
+            </w:r>
+          </w:p>
+        </w:tc>
+        <w:tc>
+          <w:tcPr>
+            <w:tcW w:w="850" w:type="dxa"/>
+            <w:tcBorders>
+              <w:top w:val="nil" w:color="000000"/>
+              <w:left w:val="nil" w:color="000000"/>
+              <w:bottom w:val="single" w:color="000000"/>
+              <w:right w:val="nil" w:color="000000"/>
+            </w:tcBorders>
+            <w:vAlign w:val="bottom"/>
+          </w:tcPr>
+          <w:p>
+            <w:pPr>
+              <w:spacing w:after="0"/>
+              <w:jc w:val="right"/>
+            </w:pPr>
+            <w:r>
+              <w:t xml:space="preserve">Both value of hull and cost of insurance added, in cases where accounts seem to suggest total outlays/returns</w:t>
             </w:r>
           </w:p>
         </w:tc>
@@ -134,7 +478,7 @@
       <w:tr>
         <w:tc>
           <w:tcPr>
-            <w:tcW w:w="3120" w:type="dxa"/>
+            <w:tcW w:w="850" w:type="dxa"/>
             <w:tcBorders>
               <w:top w:val="single" w:color="000000"/>
               <w:left w:val="nil" w:color="000000"/>
@@ -155,7 +499,7 @@
         </w:tc>
         <w:tc>
           <w:tcPr>
-            <w:tcW w:w="3120" w:type="dxa"/>
+            <w:tcW w:w="850" w:type="dxa"/>
             <w:tcBorders>
               <w:top w:val="single" w:color="000000"/>
               <w:left w:val="single" w:color="000000"/>
@@ -176,7 +520,7 @@
         </w:tc>
         <w:tc>
           <w:tcPr>
-            <w:tcW w:w="3120" w:type="dxa"/>
+            <w:tcW w:w="850" w:type="dxa"/>
             <w:tcBorders>
               <w:top w:val="single" w:color="000000"/>
               <w:left w:val="nil" w:color="000000"/>
@@ -192,6 +536,174 @@
             </w:pPr>
             <w:r>
               <w:t xml:space="preserve">0.11**</w:t>
+            </w:r>
+          </w:p>
+        </w:tc>
+        <w:tc>
+          <w:tcPr>
+            <w:tcW w:w="850" w:type="dxa"/>
+            <w:tcBorders>
+              <w:top w:val="single" w:color="000000"/>
+              <w:left w:val="nil" w:color="000000"/>
+              <w:bottom w:val="nil" w:color="000000"/>
+              <w:right w:val="nil" w:color="000000"/>
+            </w:tcBorders>
+            <w:vAlign w:val="bottom"/>
+          </w:tcPr>
+          <w:p>
+            <w:pPr>
+              <w:spacing w:after="0"/>
+              <w:jc w:val="center"/>
+            </w:pPr>
+            <w:r>
+              <w:t xml:space="preserve">0.09**</w:t>
+            </w:r>
+          </w:p>
+        </w:tc>
+        <w:tc>
+          <w:tcPr>
+            <w:tcW w:w="850" w:type="dxa"/>
+            <w:tcBorders>
+              <w:top w:val="single" w:color="000000"/>
+              <w:left w:val="nil" w:color="000000"/>
+              <w:bottom w:val="nil" w:color="000000"/>
+              <w:right w:val="nil" w:color="000000"/>
+            </w:tcBorders>
+            <w:vAlign w:val="bottom"/>
+          </w:tcPr>
+          <w:p>
+            <w:pPr>
+              <w:spacing w:after="0"/>
+              <w:jc w:val="center"/>
+            </w:pPr>
+            <w:r>
+              <w:t xml:space="preserve">0.17***</w:t>
+            </w:r>
+          </w:p>
+        </w:tc>
+        <w:tc>
+          <w:tcPr>
+            <w:tcW w:w="850" w:type="dxa"/>
+            <w:tcBorders>
+              <w:top w:val="single" w:color="000000"/>
+              <w:left w:val="nil" w:color="000000"/>
+              <w:bottom w:val="nil" w:color="000000"/>
+              <w:right w:val="nil" w:color="000000"/>
+            </w:tcBorders>
+            <w:vAlign w:val="bottom"/>
+          </w:tcPr>
+          <w:p>
+            <w:pPr>
+              <w:spacing w:after="0"/>
+              <w:jc w:val="center"/>
+            </w:pPr>
+            <w:r>
+              <w:t xml:space="preserve">0.13***</w:t>
+            </w:r>
+          </w:p>
+        </w:tc>
+        <w:tc>
+          <w:tcPr>
+            <w:tcW w:w="850" w:type="dxa"/>
+            <w:tcBorders>
+              <w:top w:val="single" w:color="000000"/>
+              <w:left w:val="nil" w:color="000000"/>
+              <w:bottom w:val="nil" w:color="000000"/>
+              <w:right w:val="nil" w:color="000000"/>
+            </w:tcBorders>
+            <w:vAlign w:val="bottom"/>
+          </w:tcPr>
+          <w:p>
+            <w:pPr>
+              <w:spacing w:after="0"/>
+              <w:jc w:val="center"/>
+            </w:pPr>
+            <w:r>
+              <w:t xml:space="preserve">0.13***</w:t>
+            </w:r>
+          </w:p>
+        </w:tc>
+        <w:tc>
+          <w:tcPr>
+            <w:tcW w:w="850" w:type="dxa"/>
+            <w:tcBorders>
+              <w:top w:val="single" w:color="000000"/>
+              <w:left w:val="nil" w:color="000000"/>
+              <w:bottom w:val="nil" w:color="000000"/>
+              <w:right w:val="nil" w:color="000000"/>
+            </w:tcBorders>
+            <w:vAlign w:val="bottom"/>
+          </w:tcPr>
+          <w:p>
+            <w:pPr>
+              <w:spacing w:after="0"/>
+              <w:jc w:val="center"/>
+            </w:pPr>
+            <w:r>
+              <w:t xml:space="preserve">0.18***</w:t>
+            </w:r>
+          </w:p>
+        </w:tc>
+        <w:tc>
+          <w:tcPr>
+            <w:tcW w:w="850" w:type="dxa"/>
+            <w:tcBorders>
+              <w:top w:val="single" w:color="000000"/>
+              <w:left w:val="nil" w:color="000000"/>
+              <w:bottom w:val="nil" w:color="000000"/>
+              <w:right w:val="nil" w:color="000000"/>
+            </w:tcBorders>
+            <w:vAlign w:val="bottom"/>
+          </w:tcPr>
+          <w:p>
+            <w:pPr>
+              <w:spacing w:after="0"/>
+              <w:jc w:val="center"/>
+            </w:pPr>
+            <w:r>
+              <w:t xml:space="preserve">0.15***</w:t>
+            </w:r>
+          </w:p>
+        </w:tc>
+        <w:tc>
+          <w:tcPr>
+            <w:tcW w:w="850" w:type="dxa"/>
+            <w:tcBorders>
+              <w:top w:val="single" w:color="000000"/>
+              <w:left w:val="nil" w:color="000000"/>
+              <w:bottom w:val="nil" w:color="000000"/>
+              <w:right w:val="nil" w:color="000000"/>
+            </w:tcBorders>
+            <w:vAlign w:val="bottom"/>
+          </w:tcPr>
+          <w:p>
+            <w:pPr>
+              <w:spacing w:after="0"/>
+              <w:jc w:val="center"/>
+            </w:pPr>
+            <w:r>
+              <w:t xml:space="preserve">0.12***</w:t>
+            </w:r>
+          </w:p>
+        </w:tc>
+        <w:tc>
+          <w:tcPr>
+            <w:tcW w:w="850" w:type="dxa"/>
+            <w:tcBorders>
+              <w:top w:val="single" w:color="000000"/>
+              <w:left w:val="nil" w:color="000000"/>
+              <w:bottom w:val="nil" w:color="000000"/>
+              <w:right w:val="nil" w:color="000000"/>
+            </w:tcBorders>
+            <w:vAlign w:val="bottom"/>
+          </w:tcPr>
+          <w:p>
+            <w:pPr>
+              <w:spacing w:after="0"/>
+              <w:jc w:val="center"/>
+            </w:pPr>
+            <w:r>
+              <w:t xml:space="preserve">0.14***</w:t>
             </w:r>
           </w:p>
         </w:tc>
@@ -199,7 +711,7 @@
       <w:tr>
         <w:tc>
           <w:tcPr>
-            <w:tcW w:w="3120" w:type="dxa"/>
+            <w:tcW w:w="850" w:type="dxa"/>
             <w:tcBorders>
               <w:top w:val="nil" w:color="000000"/>
               <w:left w:val="nil" w:color="000000"/>
@@ -215,7 +727,7 @@
         </w:tc>
         <w:tc>
           <w:tcPr>
-            <w:tcW w:w="3120" w:type="dxa"/>
+            <w:tcW w:w="850" w:type="dxa"/>
             <w:tcBorders>
               <w:top w:val="nil" w:color="000000"/>
               <w:left w:val="single" w:color="000000"/>
@@ -236,7 +748,7 @@
         </w:tc>
         <w:tc>
           <w:tcPr>
-            <w:tcW w:w="3120" w:type="dxa"/>
+            <w:tcW w:w="850" w:type="dxa"/>
             <w:tcBorders>
               <w:top w:val="nil" w:color="000000"/>
               <w:left w:val="nil" w:color="000000"/>
@@ -252,6 +764,174 @@
             </w:pPr>
             <w:r>
               <w:t xml:space="preserve">[0.02,0.20]</w:t>
+            </w:r>
+          </w:p>
+        </w:tc>
+        <w:tc>
+          <w:tcPr>
+            <w:tcW w:w="850" w:type="dxa"/>
+            <w:tcBorders>
+              <w:top w:val="nil" w:color="000000"/>
+              <w:left w:val="nil" w:color="000000"/>
+              <w:bottom w:val="nil" w:color="000000"/>
+              <w:right w:val="nil" w:color="000000"/>
+            </w:tcBorders>
+            <w:vAlign w:val="bottom"/>
+          </w:tcPr>
+          <w:p>
+            <w:pPr>
+              <w:spacing w:after="0"/>
+              <w:jc w:val="center"/>
+            </w:pPr>
+            <w:r>
+              <w:t xml:space="preserve">[0.01,0.18]</w:t>
+            </w:r>
+          </w:p>
+        </w:tc>
+        <w:tc>
+          <w:tcPr>
+            <w:tcW w:w="850" w:type="dxa"/>
+            <w:tcBorders>
+              <w:top w:val="nil" w:color="000000"/>
+              <w:left w:val="nil" w:color="000000"/>
+              <w:bottom w:val="nil" w:color="000000"/>
+              <w:right w:val="nil" w:color="000000"/>
+            </w:tcBorders>
+            <w:vAlign w:val="bottom"/>
+          </w:tcPr>
+          <w:p>
+            <w:pPr>
+              <w:spacing w:after="0"/>
+              <w:jc w:val="center"/>
+            </w:pPr>
+            <w:r>
+              <w:t xml:space="preserve">[0.07,0.27]</w:t>
+            </w:r>
+          </w:p>
+        </w:tc>
+        <w:tc>
+          <w:tcPr>
+            <w:tcW w:w="850" w:type="dxa"/>
+            <w:tcBorders>
+              <w:top w:val="nil" w:color="000000"/>
+              <w:left w:val="nil" w:color="000000"/>
+              <w:bottom w:val="nil" w:color="000000"/>
+              <w:right w:val="nil" w:color="000000"/>
+            </w:tcBorders>
+            <w:vAlign w:val="bottom"/>
+          </w:tcPr>
+          <w:p>
+            <w:pPr>
+              <w:spacing w:after="0"/>
+              <w:jc w:val="center"/>
+            </w:pPr>
+            <w:r>
+              <w:t xml:space="preserve">[0.05,0.22]</w:t>
+            </w:r>
+          </w:p>
+        </w:tc>
+        <w:tc>
+          <w:tcPr>
+            <w:tcW w:w="850" w:type="dxa"/>
+            <w:tcBorders>
+              <w:top w:val="nil" w:color="000000"/>
+              <w:left w:val="nil" w:color="000000"/>
+              <w:bottom w:val="nil" w:color="000000"/>
+              <w:right w:val="nil" w:color="000000"/>
+            </w:tcBorders>
+            <w:vAlign w:val="bottom"/>
+          </w:tcPr>
+          <w:p>
+            <w:pPr>
+              <w:spacing w:after="0"/>
+              <w:jc w:val="center"/>
+            </w:pPr>
+            <w:r>
+              <w:t xml:space="preserve">[0.05,0.22]</w:t>
+            </w:r>
+          </w:p>
+        </w:tc>
+        <w:tc>
+          <w:tcPr>
+            <w:tcW w:w="850" w:type="dxa"/>
+            <w:tcBorders>
+              <w:top w:val="nil" w:color="000000"/>
+              <w:left w:val="nil" w:color="000000"/>
+              <w:bottom w:val="nil" w:color="000000"/>
+              <w:right w:val="nil" w:color="000000"/>
+            </w:tcBorders>
+            <w:vAlign w:val="bottom"/>
+          </w:tcPr>
+          <w:p>
+            <w:pPr>
+              <w:spacing w:after="0"/>
+              <w:jc w:val="center"/>
+            </w:pPr>
+            <w:r>
+              <w:t xml:space="preserve">[0.09,0.27]</w:t>
+            </w:r>
+          </w:p>
+        </w:tc>
+        <w:tc>
+          <w:tcPr>
+            <w:tcW w:w="850" w:type="dxa"/>
+            <w:tcBorders>
+              <w:top w:val="nil" w:color="000000"/>
+              <w:left w:val="nil" w:color="000000"/>
+              <w:bottom w:val="nil" w:color="000000"/>
+              <w:right w:val="nil" w:color="000000"/>
+            </w:tcBorders>
+            <w:vAlign w:val="bottom"/>
+          </w:tcPr>
+          <w:p>
+            <w:pPr>
+              <w:spacing w:after="0"/>
+              <w:jc w:val="center"/>
+            </w:pPr>
+            <w:r>
+              <w:t xml:space="preserve">[0.06,0.24]</w:t>
+            </w:r>
+          </w:p>
+        </w:tc>
+        <w:tc>
+          <w:tcPr>
+            <w:tcW w:w="850" w:type="dxa"/>
+            <w:tcBorders>
+              <w:top w:val="nil" w:color="000000"/>
+              <w:left w:val="nil" w:color="000000"/>
+              <w:bottom w:val="nil" w:color="000000"/>
+              <w:right w:val="nil" w:color="000000"/>
+            </w:tcBorders>
+            <w:vAlign w:val="bottom"/>
+          </w:tcPr>
+          <w:p>
+            <w:pPr>
+              <w:spacing w:after="0"/>
+              <w:jc w:val="center"/>
+            </w:pPr>
+            <w:r>
+              <w:t xml:space="preserve">[0.04,0.21]</w:t>
+            </w:r>
+          </w:p>
+        </w:tc>
+        <w:tc>
+          <w:tcPr>
+            <w:tcW w:w="850" w:type="dxa"/>
+            <w:tcBorders>
+              <w:top w:val="nil" w:color="000000"/>
+              <w:left w:val="nil" w:color="000000"/>
+              <w:bottom w:val="nil" w:color="000000"/>
+              <w:right w:val="nil" w:color="000000"/>
+            </w:tcBorders>
+            <w:vAlign w:val="bottom"/>
+          </w:tcPr>
+          <w:p>
+            <w:pPr>
+              <w:spacing w:after="0"/>
+              <w:jc w:val="center"/>
+            </w:pPr>
+            <w:r>
+              <w:t xml:space="preserve">[0.05,0.22]</w:t>
             </w:r>
           </w:p>
         </w:tc>
@@ -259,7 +939,7 @@
       <w:tr>
         <w:tc>
           <w:tcPr>
-            <w:tcW w:w="3120" w:type="dxa"/>
+            <w:tcW w:w="850" w:type="dxa"/>
             <w:tcBorders>
               <w:top w:val="nil" w:color="000000"/>
               <w:left w:val="nil" w:color="000000"/>
@@ -280,7 +960,7 @@
         </w:tc>
         <w:tc>
           <w:tcPr>
-            <w:tcW w:w="3120" w:type="dxa"/>
+            <w:tcW w:w="850" w:type="dxa"/>
             <w:tcBorders>
               <w:top w:val="nil" w:color="000000"/>
               <w:left w:val="single" w:color="000000"/>
@@ -301,7 +981,7 @@
         </w:tc>
         <w:tc>
           <w:tcPr>
-            <w:tcW w:w="3120" w:type="dxa"/>
+            <w:tcW w:w="850" w:type="dxa"/>
             <w:tcBorders>
               <w:top w:val="nil" w:color="000000"/>
               <w:left w:val="nil" w:color="000000"/>
@@ -317,6 +997,174 @@
             </w:pPr>
             <w:r>
               <w:t xml:space="preserve">-1.22***</w:t>
+            </w:r>
+          </w:p>
+        </w:tc>
+        <w:tc>
+          <w:tcPr>
+            <w:tcW w:w="850" w:type="dxa"/>
+            <w:tcBorders>
+              <w:top w:val="nil" w:color="000000"/>
+              <w:left w:val="nil" w:color="000000"/>
+              <w:bottom w:val="nil" w:color="000000"/>
+              <w:right w:val="nil" w:color="000000"/>
+            </w:tcBorders>
+            <w:vAlign w:val="bottom"/>
+          </w:tcPr>
+          <w:p>
+            <w:pPr>
+              <w:spacing w:after="0"/>
+              <w:jc w:val="center"/>
+            </w:pPr>
+            <w:r>
+              <w:t xml:space="preserve">-1.36***</w:t>
+            </w:r>
+          </w:p>
+        </w:tc>
+        <w:tc>
+          <w:tcPr>
+            <w:tcW w:w="850" w:type="dxa"/>
+            <w:tcBorders>
+              <w:top w:val="nil" w:color="000000"/>
+              <w:left w:val="nil" w:color="000000"/>
+              <w:bottom w:val="nil" w:color="000000"/>
+              <w:right w:val="nil" w:color="000000"/>
+            </w:tcBorders>
+            <w:vAlign w:val="bottom"/>
+          </w:tcPr>
+          <w:p>
+            <w:pPr>
+              <w:spacing w:after="0"/>
+              <w:jc w:val="center"/>
+            </w:pPr>
+            <w:r>
+              <w:t xml:space="preserve">-1.09***</w:t>
+            </w:r>
+          </w:p>
+        </w:tc>
+        <w:tc>
+          <w:tcPr>
+            <w:tcW w:w="850" w:type="dxa"/>
+            <w:tcBorders>
+              <w:top w:val="nil" w:color="000000"/>
+              <w:left w:val="nil" w:color="000000"/>
+              <w:bottom w:val="nil" w:color="000000"/>
+              <w:right w:val="nil" w:color="000000"/>
+            </w:tcBorders>
+            <w:vAlign w:val="bottom"/>
+          </w:tcPr>
+          <w:p>
+            <w:pPr>
+              <w:spacing w:after="0"/>
+              <w:jc w:val="center"/>
+            </w:pPr>
+            <w:r>
+              <w:t xml:space="preserve">-1.22***</w:t>
+            </w:r>
+          </w:p>
+        </w:tc>
+        <w:tc>
+          <w:tcPr>
+            <w:tcW w:w="850" w:type="dxa"/>
+            <w:tcBorders>
+              <w:top w:val="nil" w:color="000000"/>
+              <w:left w:val="nil" w:color="000000"/>
+              <w:bottom w:val="nil" w:color="000000"/>
+              <w:right w:val="nil" w:color="000000"/>
+            </w:tcBorders>
+            <w:vAlign w:val="bottom"/>
+          </w:tcPr>
+          <w:p>
+            <w:pPr>
+              <w:spacing w:after="0"/>
+              <w:jc w:val="center"/>
+            </w:pPr>
+            <w:r>
+              <w:t xml:space="preserve">-1.21***</w:t>
+            </w:r>
+          </w:p>
+        </w:tc>
+        <w:tc>
+          <w:tcPr>
+            <w:tcW w:w="850" w:type="dxa"/>
+            <w:tcBorders>
+              <w:top w:val="nil" w:color="000000"/>
+              <w:left w:val="nil" w:color="000000"/>
+              <w:bottom w:val="nil" w:color="000000"/>
+              <w:right w:val="nil" w:color="000000"/>
+            </w:tcBorders>
+            <w:vAlign w:val="bottom"/>
+          </w:tcPr>
+          <w:p>
+            <w:pPr>
+              <w:spacing w:after="0"/>
+              <w:jc w:val="center"/>
+            </w:pPr>
+            <w:r>
+              <w:t xml:space="preserve">-1.22***</w:t>
+            </w:r>
+          </w:p>
+        </w:tc>
+        <w:tc>
+          <w:tcPr>
+            <w:tcW w:w="850" w:type="dxa"/>
+            <w:tcBorders>
+              <w:top w:val="nil" w:color="000000"/>
+              <w:left w:val="nil" w:color="000000"/>
+              <w:bottom w:val="nil" w:color="000000"/>
+              <w:right w:val="nil" w:color="000000"/>
+            </w:tcBorders>
+            <w:vAlign w:val="bottom"/>
+          </w:tcPr>
+          <w:p>
+            <w:pPr>
+              <w:spacing w:after="0"/>
+              <w:jc w:val="center"/>
+            </w:pPr>
+            <w:r>
+              <w:t xml:space="preserve">-1.25***</w:t>
+            </w:r>
+          </w:p>
+        </w:tc>
+        <w:tc>
+          <w:tcPr>
+            <w:tcW w:w="850" w:type="dxa"/>
+            <w:tcBorders>
+              <w:top w:val="nil" w:color="000000"/>
+              <w:left w:val="nil" w:color="000000"/>
+              <w:bottom w:val="nil" w:color="000000"/>
+              <w:right w:val="nil" w:color="000000"/>
+            </w:tcBorders>
+            <w:vAlign w:val="bottom"/>
+          </w:tcPr>
+          <w:p>
+            <w:pPr>
+              <w:spacing w:after="0"/>
+              <w:jc w:val="center"/>
+            </w:pPr>
+            <w:r>
+              <w:t xml:space="preserve">-1.22***</w:t>
+            </w:r>
+          </w:p>
+        </w:tc>
+        <w:tc>
+          <w:tcPr>
+            <w:tcW w:w="850" w:type="dxa"/>
+            <w:tcBorders>
+              <w:top w:val="nil" w:color="000000"/>
+              <w:left w:val="nil" w:color="000000"/>
+              <w:bottom w:val="nil" w:color="000000"/>
+              <w:right w:val="nil" w:color="000000"/>
+            </w:tcBorders>
+            <w:vAlign w:val="bottom"/>
+          </w:tcPr>
+          <w:p>
+            <w:pPr>
+              <w:spacing w:after="0"/>
+              <w:jc w:val="center"/>
+            </w:pPr>
+            <w:r>
+              <w:t xml:space="preserve">-1.25***</w:t>
             </w:r>
           </w:p>
         </w:tc>
@@ -324,7 +1172,7 @@
       <w:tr>
         <w:tc>
           <w:tcPr>
-            <w:tcW w:w="3120" w:type="dxa"/>
+            <w:tcW w:w="850" w:type="dxa"/>
             <w:tcBorders>
               <w:top w:val="nil" w:color="000000"/>
               <w:left w:val="nil" w:color="000000"/>
@@ -340,7 +1188,7 @@
         </w:tc>
         <w:tc>
           <w:tcPr>
-            <w:tcW w:w="3120" w:type="dxa"/>
+            <w:tcW w:w="850" w:type="dxa"/>
             <w:tcBorders>
               <w:top w:val="nil" w:color="000000"/>
               <w:left w:val="single" w:color="000000"/>
@@ -361,7 +1209,7 @@
         </w:tc>
         <w:tc>
           <w:tcPr>
-            <w:tcW w:w="3120" w:type="dxa"/>
+            <w:tcW w:w="850" w:type="dxa"/>
             <w:tcBorders>
               <w:top w:val="nil" w:color="000000"/>
               <w:left w:val="nil" w:color="000000"/>
@@ -377,6 +1225,174 @@
             </w:pPr>
             <w:r>
               <w:t xml:space="preserve">[-1.61,-0.83]</w:t>
+            </w:r>
+          </w:p>
+        </w:tc>
+        <w:tc>
+          <w:tcPr>
+            <w:tcW w:w="850" w:type="dxa"/>
+            <w:tcBorders>
+              <w:top w:val="nil" w:color="000000"/>
+              <w:left w:val="nil" w:color="000000"/>
+              <w:bottom w:val="nil" w:color="000000"/>
+              <w:right w:val="nil" w:color="000000"/>
+            </w:tcBorders>
+            <w:vAlign w:val="bottom"/>
+          </w:tcPr>
+          <w:p>
+            <w:pPr>
+              <w:spacing w:after="0"/>
+              <w:jc w:val="center"/>
+            </w:pPr>
+            <w:r>
+              <w:t xml:space="preserve">[-1.75,-0.96]</w:t>
+            </w:r>
+          </w:p>
+        </w:tc>
+        <w:tc>
+          <w:tcPr>
+            <w:tcW w:w="850" w:type="dxa"/>
+            <w:tcBorders>
+              <w:top w:val="nil" w:color="000000"/>
+              <w:left w:val="nil" w:color="000000"/>
+              <w:bottom w:val="nil" w:color="000000"/>
+              <w:right w:val="nil" w:color="000000"/>
+            </w:tcBorders>
+            <w:vAlign w:val="bottom"/>
+          </w:tcPr>
+          <w:p>
+            <w:pPr>
+              <w:spacing w:after="0"/>
+              <w:jc w:val="center"/>
+            </w:pPr>
+            <w:r>
+              <w:t xml:space="preserve">[-1.49,-0.69]</w:t>
+            </w:r>
+          </w:p>
+        </w:tc>
+        <w:tc>
+          <w:tcPr>
+            <w:tcW w:w="850" w:type="dxa"/>
+            <w:tcBorders>
+              <w:top w:val="nil" w:color="000000"/>
+              <w:left w:val="nil" w:color="000000"/>
+              <w:bottom w:val="nil" w:color="000000"/>
+              <w:right w:val="nil" w:color="000000"/>
+            </w:tcBorders>
+            <w:vAlign w:val="bottom"/>
+          </w:tcPr>
+          <w:p>
+            <w:pPr>
+              <w:spacing w:after="0"/>
+              <w:jc w:val="center"/>
+            </w:pPr>
+            <w:r>
+              <w:t xml:space="preserve">[-1.59,-0.85]</w:t>
+            </w:r>
+          </w:p>
+        </w:tc>
+        <w:tc>
+          <w:tcPr>
+            <w:tcW w:w="850" w:type="dxa"/>
+            <w:tcBorders>
+              <w:top w:val="nil" w:color="000000"/>
+              <w:left w:val="nil" w:color="000000"/>
+              <w:bottom w:val="nil" w:color="000000"/>
+              <w:right w:val="nil" w:color="000000"/>
+            </w:tcBorders>
+            <w:vAlign w:val="bottom"/>
+          </w:tcPr>
+          <w:p>
+            <w:pPr>
+              <w:spacing w:after="0"/>
+              <w:jc w:val="center"/>
+            </w:pPr>
+            <w:r>
+              <w:t xml:space="preserve">[-1.58,-0.84]</w:t>
+            </w:r>
+          </w:p>
+        </w:tc>
+        <w:tc>
+          <w:tcPr>
+            <w:tcW w:w="850" w:type="dxa"/>
+            <w:tcBorders>
+              <w:top w:val="nil" w:color="000000"/>
+              <w:left w:val="nil" w:color="000000"/>
+              <w:bottom w:val="nil" w:color="000000"/>
+              <w:right w:val="nil" w:color="000000"/>
+            </w:tcBorders>
+            <w:vAlign w:val="bottom"/>
+          </w:tcPr>
+          <w:p>
+            <w:pPr>
+              <w:spacing w:after="0"/>
+              <w:jc w:val="center"/>
+            </w:pPr>
+            <w:r>
+              <w:t xml:space="preserve">[-1.60,-0.84]</w:t>
+            </w:r>
+          </w:p>
+        </w:tc>
+        <w:tc>
+          <w:tcPr>
+            <w:tcW w:w="850" w:type="dxa"/>
+            <w:tcBorders>
+              <w:top w:val="nil" w:color="000000"/>
+              <w:left w:val="nil" w:color="000000"/>
+              <w:bottom w:val="nil" w:color="000000"/>
+              <w:right w:val="nil" w:color="000000"/>
+            </w:tcBorders>
+            <w:vAlign w:val="bottom"/>
+          </w:tcPr>
+          <w:p>
+            <w:pPr>
+              <w:spacing w:after="0"/>
+              <w:jc w:val="center"/>
+            </w:pPr>
+            <w:r>
+              <w:t xml:space="preserve">[-1.62,-0.88]</w:t>
+            </w:r>
+          </w:p>
+        </w:tc>
+        <w:tc>
+          <w:tcPr>
+            <w:tcW w:w="850" w:type="dxa"/>
+            <w:tcBorders>
+              <w:top w:val="nil" w:color="000000"/>
+              <w:left w:val="nil" w:color="000000"/>
+              <w:bottom w:val="nil" w:color="000000"/>
+              <w:right w:val="nil" w:color="000000"/>
+            </w:tcBorders>
+            <w:vAlign w:val="bottom"/>
+          </w:tcPr>
+          <w:p>
+            <w:pPr>
+              <w:spacing w:after="0"/>
+              <w:jc w:val="center"/>
+            </w:pPr>
+            <w:r>
+              <w:t xml:space="preserve">[-1.58,-0.86]</w:t>
+            </w:r>
+          </w:p>
+        </w:tc>
+        <w:tc>
+          <w:tcPr>
+            <w:tcW w:w="850" w:type="dxa"/>
+            <w:tcBorders>
+              <w:top w:val="nil" w:color="000000"/>
+              <w:left w:val="nil" w:color="000000"/>
+              <w:bottom w:val="nil" w:color="000000"/>
+              <w:right w:val="nil" w:color="000000"/>
+            </w:tcBorders>
+            <w:vAlign w:val="bottom"/>
+          </w:tcPr>
+          <w:p>
+            <w:pPr>
+              <w:spacing w:after="0"/>
+              <w:jc w:val="center"/>
+            </w:pPr>
+            <w:r>
+              <w:t xml:space="preserve">[-1.61,-0.89]</w:t>
             </w:r>
           </w:p>
         </w:tc>
@@ -384,7 +1400,7 @@
       <w:tr>
         <w:tc>
           <w:tcPr>
-            <w:tcW w:w="3120" w:type="dxa"/>
+            <w:tcW w:w="850" w:type="dxa"/>
             <w:tcBorders>
               <w:top w:val="nil" w:color="000000"/>
               <w:left w:val="nil" w:color="000000"/>
@@ -405,7 +1421,7 @@
         </w:tc>
         <w:tc>
           <w:tcPr>
-            <w:tcW w:w="3120" w:type="dxa"/>
+            <w:tcW w:w="850" w:type="dxa"/>
             <w:tcBorders>
               <w:top w:val="nil" w:color="000000"/>
               <w:left w:val="single" w:color="000000"/>
@@ -426,7 +1442,7 @@
         </w:tc>
         <w:tc>
           <w:tcPr>
-            <w:tcW w:w="3120" w:type="dxa"/>
+            <w:tcW w:w="850" w:type="dxa"/>
             <w:tcBorders>
               <w:top w:val="nil" w:color="000000"/>
               <w:left w:val="nil" w:color="000000"/>
@@ -442,6 +1458,174 @@
             </w:pPr>
             <w:r>
               <w:t xml:space="preserve">-0.18***</w:t>
+            </w:r>
+          </w:p>
+        </w:tc>
+        <w:tc>
+          <w:tcPr>
+            <w:tcW w:w="850" w:type="dxa"/>
+            <w:tcBorders>
+              <w:top w:val="nil" w:color="000000"/>
+              <w:left w:val="nil" w:color="000000"/>
+              <w:bottom w:val="nil" w:color="000000"/>
+              <w:right w:val="nil" w:color="000000"/>
+            </w:tcBorders>
+            <w:vAlign w:val="bottom"/>
+          </w:tcPr>
+          <w:p>
+            <w:pPr>
+              <w:spacing w:after="0"/>
+              <w:jc w:val="center"/>
+            </w:pPr>
+            <w:r>
+              <w:t xml:space="preserve">-0.23***</w:t>
+            </w:r>
+          </w:p>
+        </w:tc>
+        <w:tc>
+          <w:tcPr>
+            <w:tcW w:w="850" w:type="dxa"/>
+            <w:tcBorders>
+              <w:top w:val="nil" w:color="000000"/>
+              <w:left w:val="nil" w:color="000000"/>
+              <w:bottom w:val="nil" w:color="000000"/>
+              <w:right w:val="nil" w:color="000000"/>
+            </w:tcBorders>
+            <w:vAlign w:val="bottom"/>
+          </w:tcPr>
+          <w:p>
+            <w:pPr>
+              <w:spacing w:after="0"/>
+              <w:jc w:val="center"/>
+            </w:pPr>
+            <w:r>
+              <w:t xml:space="preserve">-0.14**</w:t>
+            </w:r>
+          </w:p>
+        </w:tc>
+        <w:tc>
+          <w:tcPr>
+            <w:tcW w:w="850" w:type="dxa"/>
+            <w:tcBorders>
+              <w:top w:val="nil" w:color="000000"/>
+              <w:left w:val="nil" w:color="000000"/>
+              <w:bottom w:val="nil" w:color="000000"/>
+              <w:right w:val="nil" w:color="000000"/>
+            </w:tcBorders>
+            <w:vAlign w:val="bottom"/>
+          </w:tcPr>
+          <w:p>
+            <w:pPr>
+              <w:spacing w:after="0"/>
+              <w:jc w:val="center"/>
+            </w:pPr>
+            <w:r>
+              <w:t xml:space="preserve">-0.18***</w:t>
+            </w:r>
+          </w:p>
+        </w:tc>
+        <w:tc>
+          <w:tcPr>
+            <w:tcW w:w="850" w:type="dxa"/>
+            <w:tcBorders>
+              <w:top w:val="nil" w:color="000000"/>
+              <w:left w:val="nil" w:color="000000"/>
+              <w:bottom w:val="nil" w:color="000000"/>
+              <w:right w:val="nil" w:color="000000"/>
+            </w:tcBorders>
+            <w:vAlign w:val="bottom"/>
+          </w:tcPr>
+          <w:p>
+            <w:pPr>
+              <w:spacing w:after="0"/>
+              <w:jc w:val="center"/>
+            </w:pPr>
+            <w:r>
+              <w:t xml:space="preserve">-0.18***</w:t>
+            </w:r>
+          </w:p>
+        </w:tc>
+        <w:tc>
+          <w:tcPr>
+            <w:tcW w:w="850" w:type="dxa"/>
+            <w:tcBorders>
+              <w:top w:val="nil" w:color="000000"/>
+              <w:left w:val="nil" w:color="000000"/>
+              <w:bottom w:val="nil" w:color="000000"/>
+              <w:right w:val="nil" w:color="000000"/>
+            </w:tcBorders>
+            <w:vAlign w:val="bottom"/>
+          </w:tcPr>
+          <w:p>
+            <w:pPr>
+              <w:spacing w:after="0"/>
+              <w:jc w:val="center"/>
+            </w:pPr>
+            <w:r>
+              <w:t xml:space="preserve">-0.16***</w:t>
+            </w:r>
+          </w:p>
+        </w:tc>
+        <w:tc>
+          <w:tcPr>
+            <w:tcW w:w="850" w:type="dxa"/>
+            <w:tcBorders>
+              <w:top w:val="nil" w:color="000000"/>
+              <w:left w:val="nil" w:color="000000"/>
+              <w:bottom w:val="nil" w:color="000000"/>
+              <w:right w:val="nil" w:color="000000"/>
+            </w:tcBorders>
+            <w:vAlign w:val="bottom"/>
+          </w:tcPr>
+          <w:p>
+            <w:pPr>
+              <w:spacing w:after="0"/>
+              <w:jc w:val="center"/>
+            </w:pPr>
+            <w:r>
+              <w:t xml:space="preserve">-0.19***</w:t>
+            </w:r>
+          </w:p>
+        </w:tc>
+        <w:tc>
+          <w:tcPr>
+            <w:tcW w:w="850" w:type="dxa"/>
+            <w:tcBorders>
+              <w:top w:val="nil" w:color="000000"/>
+              <w:left w:val="nil" w:color="000000"/>
+              <w:bottom w:val="nil" w:color="000000"/>
+              <w:right w:val="nil" w:color="000000"/>
+            </w:tcBorders>
+            <w:vAlign w:val="bottom"/>
+          </w:tcPr>
+          <w:p>
+            <w:pPr>
+              <w:spacing w:after="0"/>
+              <w:jc w:val="center"/>
+            </w:pPr>
+            <w:r>
+              <w:t xml:space="preserve">-0.20***</w:t>
+            </w:r>
+          </w:p>
+        </w:tc>
+        <w:tc>
+          <w:tcPr>
+            <w:tcW w:w="850" w:type="dxa"/>
+            <w:tcBorders>
+              <w:top w:val="nil" w:color="000000"/>
+              <w:left w:val="nil" w:color="000000"/>
+              <w:bottom w:val="nil" w:color="000000"/>
+              <w:right w:val="nil" w:color="000000"/>
+            </w:tcBorders>
+            <w:vAlign w:val="bottom"/>
+          </w:tcPr>
+          <w:p>
+            <w:pPr>
+              <w:spacing w:after="0"/>
+              <w:jc w:val="center"/>
+            </w:pPr>
+            <w:r>
+              <w:t xml:space="preserve">-0.21***</w:t>
             </w:r>
           </w:p>
         </w:tc>
@@ -449,7 +1633,7 @@
       <w:tr>
         <w:tc>
           <w:tcPr>
-            <w:tcW w:w="3120" w:type="dxa"/>
+            <w:tcW w:w="850" w:type="dxa"/>
             <w:tcBorders>
               <w:top w:val="nil" w:color="000000"/>
               <w:left w:val="nil" w:color="000000"/>
@@ -465,7 +1649,7 @@
         </w:tc>
         <w:tc>
           <w:tcPr>
-            <w:tcW w:w="3120" w:type="dxa"/>
+            <w:tcW w:w="850" w:type="dxa"/>
             <w:tcBorders>
               <w:top w:val="nil" w:color="000000"/>
               <w:left w:val="single" w:color="000000"/>
@@ -486,7 +1670,7 @@
         </w:tc>
         <w:tc>
           <w:tcPr>
-            <w:tcW w:w="3120" w:type="dxa"/>
+            <w:tcW w:w="850" w:type="dxa"/>
             <w:tcBorders>
               <w:top w:val="nil" w:color="000000"/>
               <w:left w:val="nil" w:color="000000"/>
@@ -502,6 +1686,174 @@
             </w:pPr>
             <w:r>
               <w:t xml:space="preserve">[-0.28,-0.07]</w:t>
+            </w:r>
+          </w:p>
+        </w:tc>
+        <w:tc>
+          <w:tcPr>
+            <w:tcW w:w="850" w:type="dxa"/>
+            <w:tcBorders>
+              <w:top w:val="nil" w:color="000000"/>
+              <w:left w:val="nil" w:color="000000"/>
+              <w:bottom w:val="nil" w:color="000000"/>
+              <w:right w:val="nil" w:color="000000"/>
+            </w:tcBorders>
+            <w:vAlign w:val="bottom"/>
+          </w:tcPr>
+          <w:p>
+            <w:pPr>
+              <w:spacing w:after="0"/>
+              <w:jc w:val="center"/>
+            </w:pPr>
+            <w:r>
+              <w:t xml:space="preserve">[-0.32,-0.13]</w:t>
+            </w:r>
+          </w:p>
+        </w:tc>
+        <w:tc>
+          <w:tcPr>
+            <w:tcW w:w="850" w:type="dxa"/>
+            <w:tcBorders>
+              <w:top w:val="nil" w:color="000000"/>
+              <w:left w:val="nil" w:color="000000"/>
+              <w:bottom w:val="nil" w:color="000000"/>
+              <w:right w:val="nil" w:color="000000"/>
+            </w:tcBorders>
+            <w:vAlign w:val="bottom"/>
+          </w:tcPr>
+          <w:p>
+            <w:pPr>
+              <w:spacing w:after="0"/>
+              <w:jc w:val="center"/>
+            </w:pPr>
+            <w:r>
+              <w:t xml:space="preserve">[-0.24,-0.03]</w:t>
+            </w:r>
+          </w:p>
+        </w:tc>
+        <w:tc>
+          <w:tcPr>
+            <w:tcW w:w="850" w:type="dxa"/>
+            <w:tcBorders>
+              <w:top w:val="nil" w:color="000000"/>
+              <w:left w:val="nil" w:color="000000"/>
+              <w:bottom w:val="nil" w:color="000000"/>
+              <w:right w:val="nil" w:color="000000"/>
+            </w:tcBorders>
+            <w:vAlign w:val="bottom"/>
+          </w:tcPr>
+          <w:p>
+            <w:pPr>
+              <w:spacing w:after="0"/>
+              <w:jc w:val="center"/>
+            </w:pPr>
+            <w:r>
+              <w:t xml:space="preserve">[-0.27,-0.09]</w:t>
+            </w:r>
+          </w:p>
+        </w:tc>
+        <w:tc>
+          <w:tcPr>
+            <w:tcW w:w="850" w:type="dxa"/>
+            <w:tcBorders>
+              <w:top w:val="nil" w:color="000000"/>
+              <w:left w:val="nil" w:color="000000"/>
+              <w:bottom w:val="nil" w:color="000000"/>
+              <w:right w:val="nil" w:color="000000"/>
+            </w:tcBorders>
+            <w:vAlign w:val="bottom"/>
+          </w:tcPr>
+          <w:p>
+            <w:pPr>
+              <w:spacing w:after="0"/>
+              <w:jc w:val="center"/>
+            </w:pPr>
+            <w:r>
+              <w:t xml:space="preserve">[-0.27,-0.08]</w:t>
+            </w:r>
+          </w:p>
+        </w:tc>
+        <w:tc>
+          <w:tcPr>
+            <w:tcW w:w="850" w:type="dxa"/>
+            <w:tcBorders>
+              <w:top w:val="nil" w:color="000000"/>
+              <w:left w:val="nil" w:color="000000"/>
+              <w:bottom w:val="nil" w:color="000000"/>
+              <w:right w:val="nil" w:color="000000"/>
+            </w:tcBorders>
+            <w:vAlign w:val="bottom"/>
+          </w:tcPr>
+          <w:p>
+            <w:pPr>
+              <w:spacing w:after="0"/>
+              <w:jc w:val="center"/>
+            </w:pPr>
+            <w:r>
+              <w:t xml:space="preserve">[-0.27,-0.05]</w:t>
+            </w:r>
+          </w:p>
+        </w:tc>
+        <w:tc>
+          <w:tcPr>
+            <w:tcW w:w="850" w:type="dxa"/>
+            <w:tcBorders>
+              <w:top w:val="nil" w:color="000000"/>
+              <w:left w:val="nil" w:color="000000"/>
+              <w:bottom w:val="nil" w:color="000000"/>
+              <w:right w:val="nil" w:color="000000"/>
+            </w:tcBorders>
+            <w:vAlign w:val="bottom"/>
+          </w:tcPr>
+          <w:p>
+            <w:pPr>
+              <w:spacing w:after="0"/>
+              <w:jc w:val="center"/>
+            </w:pPr>
+            <w:r>
+              <w:t xml:space="preserve">[-0.28,-0.09]</w:t>
+            </w:r>
+          </w:p>
+        </w:tc>
+        <w:tc>
+          <w:tcPr>
+            <w:tcW w:w="850" w:type="dxa"/>
+            <w:tcBorders>
+              <w:top w:val="nil" w:color="000000"/>
+              <w:left w:val="nil" w:color="000000"/>
+              <w:bottom w:val="nil" w:color="000000"/>
+              <w:right w:val="nil" w:color="000000"/>
+            </w:tcBorders>
+            <w:vAlign w:val="bottom"/>
+          </w:tcPr>
+          <w:p>
+            <w:pPr>
+              <w:spacing w:after="0"/>
+              <w:jc w:val="center"/>
+            </w:pPr>
+            <w:r>
+              <w:t xml:space="preserve">[-0.29,-0.11]</w:t>
+            </w:r>
+          </w:p>
+        </w:tc>
+        <w:tc>
+          <w:tcPr>
+            <w:tcW w:w="850" w:type="dxa"/>
+            <w:tcBorders>
+              <w:top w:val="nil" w:color="000000"/>
+              <w:left w:val="nil" w:color="000000"/>
+              <w:bottom w:val="nil" w:color="000000"/>
+              <w:right w:val="nil" w:color="000000"/>
+            </w:tcBorders>
+            <w:vAlign w:val="bottom"/>
+          </w:tcPr>
+          <w:p>
+            <w:pPr>
+              <w:spacing w:after="0"/>
+              <w:jc w:val="center"/>
+            </w:pPr>
+            <w:r>
+              <w:t xml:space="preserve">[-0.30,-0.12]</w:t>
             </w:r>
           </w:p>
         </w:tc>
@@ -509,7 +1861,7 @@
       <w:tr>
         <w:tc>
           <w:tcPr>
-            <w:tcW w:w="3120" w:type="dxa"/>
+            <w:tcW w:w="850" w:type="dxa"/>
             <w:tcBorders>
               <w:top w:val="nil" w:color="000000"/>
               <w:left w:val="nil" w:color="000000"/>
@@ -530,7 +1882,7 @@
         </w:tc>
         <w:tc>
           <w:tcPr>
-            <w:tcW w:w="3120" w:type="dxa"/>
+            <w:tcW w:w="850" w:type="dxa"/>
             <w:tcBorders>
               <w:top w:val="nil" w:color="000000"/>
               <w:left w:val="single" w:color="000000"/>
@@ -551,7 +1903,175 @@
         </w:tc>
         <w:tc>
           <w:tcPr>
-            <w:tcW w:w="3120" w:type="dxa"/>
+            <w:tcW w:w="850" w:type="dxa"/>
+            <w:tcBorders>
+              <w:top w:val="nil" w:color="000000"/>
+              <w:left w:val="nil" w:color="000000"/>
+              <w:bottom w:val="nil" w:color="000000"/>
+              <w:right w:val="nil" w:color="000000"/>
+            </w:tcBorders>
+            <w:vAlign w:val="bottom"/>
+          </w:tcPr>
+          <w:p>
+            <w:pPr>
+              <w:spacing w:after="0"/>
+              <w:jc w:val="center"/>
+            </w:pPr>
+            <w:r>
+              <w:t xml:space="preserve">-0.02</w:t>
+            </w:r>
+          </w:p>
+        </w:tc>
+        <w:tc>
+          <w:tcPr>
+            <w:tcW w:w="850" w:type="dxa"/>
+            <w:tcBorders>
+              <w:top w:val="nil" w:color="000000"/>
+              <w:left w:val="nil" w:color="000000"/>
+              <w:bottom w:val="nil" w:color="000000"/>
+              <w:right w:val="nil" w:color="000000"/>
+            </w:tcBorders>
+            <w:vAlign w:val="bottom"/>
+          </w:tcPr>
+          <w:p>
+            <w:pPr>
+              <w:spacing w:after="0"/>
+              <w:jc w:val="center"/>
+            </w:pPr>
+            <w:r>
+              <w:t xml:space="preserve">-0.02</w:t>
+            </w:r>
+          </w:p>
+        </w:tc>
+        <w:tc>
+          <w:tcPr>
+            <w:tcW w:w="850" w:type="dxa"/>
+            <w:tcBorders>
+              <w:top w:val="nil" w:color="000000"/>
+              <w:left w:val="nil" w:color="000000"/>
+              <w:bottom w:val="nil" w:color="000000"/>
+              <w:right w:val="nil" w:color="000000"/>
+            </w:tcBorders>
+            <w:vAlign w:val="bottom"/>
+          </w:tcPr>
+          <w:p>
+            <w:pPr>
+              <w:spacing w:after="0"/>
+              <w:jc w:val="center"/>
+            </w:pPr>
+            <w:r>
+              <w:t xml:space="preserve">-0.02</w:t>
+            </w:r>
+          </w:p>
+        </w:tc>
+        <w:tc>
+          <w:tcPr>
+            <w:tcW w:w="850" w:type="dxa"/>
+            <w:tcBorders>
+              <w:top w:val="nil" w:color="000000"/>
+              <w:left w:val="nil" w:color="000000"/>
+              <w:bottom w:val="nil" w:color="000000"/>
+              <w:right w:val="nil" w:color="000000"/>
+            </w:tcBorders>
+            <w:vAlign w:val="bottom"/>
+          </w:tcPr>
+          <w:p>
+            <w:pPr>
+              <w:spacing w:after="0"/>
+              <w:jc w:val="center"/>
+            </w:pPr>
+            <w:r>
+              <w:t xml:space="preserve">-0.02</w:t>
+            </w:r>
+          </w:p>
+        </w:tc>
+        <w:tc>
+          <w:tcPr>
+            <w:tcW w:w="850" w:type="dxa"/>
+            <w:tcBorders>
+              <w:top w:val="nil" w:color="000000"/>
+              <w:left w:val="nil" w:color="000000"/>
+              <w:bottom w:val="nil" w:color="000000"/>
+              <w:right w:val="nil" w:color="000000"/>
+            </w:tcBorders>
+            <w:vAlign w:val="bottom"/>
+          </w:tcPr>
+          <w:p>
+            <w:pPr>
+              <w:spacing w:after="0"/>
+              <w:jc w:val="center"/>
+            </w:pPr>
+            <w:r>
+              <w:t xml:space="preserve">-0.02</w:t>
+            </w:r>
+          </w:p>
+        </w:tc>
+        <w:tc>
+          <w:tcPr>
+            <w:tcW w:w="850" w:type="dxa"/>
+            <w:tcBorders>
+              <w:top w:val="nil" w:color="000000"/>
+              <w:left w:val="nil" w:color="000000"/>
+              <w:bottom w:val="nil" w:color="000000"/>
+              <w:right w:val="nil" w:color="000000"/>
+            </w:tcBorders>
+            <w:vAlign w:val="bottom"/>
+          </w:tcPr>
+          <w:p>
+            <w:pPr>
+              <w:spacing w:after="0"/>
+              <w:jc w:val="center"/>
+            </w:pPr>
+            <w:r>
+              <w:t xml:space="preserve">-0.02</w:t>
+            </w:r>
+          </w:p>
+        </w:tc>
+        <w:tc>
+          <w:tcPr>
+            <w:tcW w:w="850" w:type="dxa"/>
+            <w:tcBorders>
+              <w:top w:val="nil" w:color="000000"/>
+              <w:left w:val="nil" w:color="000000"/>
+              <w:bottom w:val="nil" w:color="000000"/>
+              <w:right w:val="nil" w:color="000000"/>
+            </w:tcBorders>
+            <w:vAlign w:val="bottom"/>
+          </w:tcPr>
+          <w:p>
+            <w:pPr>
+              <w:spacing w:after="0"/>
+              <w:jc w:val="center"/>
+            </w:pPr>
+            <w:r>
+              <w:t xml:space="preserve">-0.02</w:t>
+            </w:r>
+          </w:p>
+        </w:tc>
+        <w:tc>
+          <w:tcPr>
+            <w:tcW w:w="850" w:type="dxa"/>
+            <w:tcBorders>
+              <w:top w:val="nil" w:color="000000"/>
+              <w:left w:val="nil" w:color="000000"/>
+              <w:bottom w:val="nil" w:color="000000"/>
+              <w:right w:val="nil" w:color="000000"/>
+            </w:tcBorders>
+            <w:vAlign w:val="bottom"/>
+          </w:tcPr>
+          <w:p>
+            <w:pPr>
+              <w:spacing w:after="0"/>
+              <w:jc w:val="center"/>
+            </w:pPr>
+            <w:r>
+              <w:t xml:space="preserve">-0.02</w:t>
+            </w:r>
+          </w:p>
+        </w:tc>
+        <w:tc>
+          <w:tcPr>
+            <w:tcW w:w="850" w:type="dxa"/>
             <w:tcBorders>
               <w:top w:val="nil" w:color="000000"/>
               <w:left w:val="nil" w:color="000000"/>
@@ -574,7 +2094,7 @@
       <w:tr>
         <w:tc>
           <w:tcPr>
-            <w:tcW w:w="3120" w:type="dxa"/>
+            <w:tcW w:w="850" w:type="dxa"/>
             <w:tcBorders>
               <w:top w:val="nil" w:color="000000"/>
               <w:left w:val="nil" w:color="000000"/>
@@ -590,7 +2110,7 @@
         </w:tc>
         <w:tc>
           <w:tcPr>
-            <w:tcW w:w="3120" w:type="dxa"/>
+            <w:tcW w:w="850" w:type="dxa"/>
             <w:tcBorders>
               <w:top w:val="nil" w:color="000000"/>
               <w:left w:val="single" w:color="000000"/>
@@ -611,7 +2131,175 @@
         </w:tc>
         <w:tc>
           <w:tcPr>
-            <w:tcW w:w="3120" w:type="dxa"/>
+            <w:tcW w:w="850" w:type="dxa"/>
+            <w:tcBorders>
+              <w:top w:val="nil" w:color="000000"/>
+              <w:left w:val="nil" w:color="000000"/>
+              <w:bottom w:val="nil" w:color="000000"/>
+              <w:right w:val="nil" w:color="000000"/>
+            </w:tcBorders>
+            <w:vAlign w:val="bottom"/>
+          </w:tcPr>
+          <w:p>
+            <w:pPr>
+              <w:spacing w:after="0"/>
+              <w:jc w:val="center"/>
+            </w:pPr>
+            <w:r>
+              <w:t xml:space="preserve">[-0.06,0.01]</w:t>
+            </w:r>
+          </w:p>
+        </w:tc>
+        <w:tc>
+          <w:tcPr>
+            <w:tcW w:w="850" w:type="dxa"/>
+            <w:tcBorders>
+              <w:top w:val="nil" w:color="000000"/>
+              <w:left w:val="nil" w:color="000000"/>
+              <w:bottom w:val="nil" w:color="000000"/>
+              <w:right w:val="nil" w:color="000000"/>
+            </w:tcBorders>
+            <w:vAlign w:val="bottom"/>
+          </w:tcPr>
+          <w:p>
+            <w:pPr>
+              <w:spacing w:after="0"/>
+              <w:jc w:val="center"/>
+            </w:pPr>
+            <w:r>
+              <w:t xml:space="preserve">[-0.06,0.01]</w:t>
+            </w:r>
+          </w:p>
+        </w:tc>
+        <w:tc>
+          <w:tcPr>
+            <w:tcW w:w="850" w:type="dxa"/>
+            <w:tcBorders>
+              <w:top w:val="nil" w:color="000000"/>
+              <w:left w:val="nil" w:color="000000"/>
+              <w:bottom w:val="nil" w:color="000000"/>
+              <w:right w:val="nil" w:color="000000"/>
+            </w:tcBorders>
+            <w:vAlign w:val="bottom"/>
+          </w:tcPr>
+          <w:p>
+            <w:pPr>
+              <w:spacing w:after="0"/>
+              <w:jc w:val="center"/>
+            </w:pPr>
+            <w:r>
+              <w:t xml:space="preserve">[-0.05,0.01]</w:t>
+            </w:r>
+          </w:p>
+        </w:tc>
+        <w:tc>
+          <w:tcPr>
+            <w:tcW w:w="850" w:type="dxa"/>
+            <w:tcBorders>
+              <w:top w:val="nil" w:color="000000"/>
+              <w:left w:val="nil" w:color="000000"/>
+              <w:bottom w:val="nil" w:color="000000"/>
+              <w:right w:val="nil" w:color="000000"/>
+            </w:tcBorders>
+            <w:vAlign w:val="bottom"/>
+          </w:tcPr>
+          <w:p>
+            <w:pPr>
+              <w:spacing w:after="0"/>
+              <w:jc w:val="center"/>
+            </w:pPr>
+            <w:r>
+              <w:t xml:space="preserve">[-0.05,0.01]</w:t>
+            </w:r>
+          </w:p>
+        </w:tc>
+        <w:tc>
+          <w:tcPr>
+            <w:tcW w:w="850" w:type="dxa"/>
+            <w:tcBorders>
+              <w:top w:val="nil" w:color="000000"/>
+              <w:left w:val="nil" w:color="000000"/>
+              <w:bottom w:val="nil" w:color="000000"/>
+              <w:right w:val="nil" w:color="000000"/>
+            </w:tcBorders>
+            <w:vAlign w:val="bottom"/>
+          </w:tcPr>
+          <w:p>
+            <w:pPr>
+              <w:spacing w:after="0"/>
+              <w:jc w:val="center"/>
+            </w:pPr>
+            <w:r>
+              <w:t xml:space="preserve">[-0.05,0.01]</w:t>
+            </w:r>
+          </w:p>
+        </w:tc>
+        <w:tc>
+          <w:tcPr>
+            <w:tcW w:w="850" w:type="dxa"/>
+            <w:tcBorders>
+              <w:top w:val="nil" w:color="000000"/>
+              <w:left w:val="nil" w:color="000000"/>
+              <w:bottom w:val="nil" w:color="000000"/>
+              <w:right w:val="nil" w:color="000000"/>
+            </w:tcBorders>
+            <w:vAlign w:val="bottom"/>
+          </w:tcPr>
+          <w:p>
+            <w:pPr>
+              <w:spacing w:after="0"/>
+              <w:jc w:val="center"/>
+            </w:pPr>
+            <w:r>
+              <w:t xml:space="preserve">[-0.05,0.02]</w:t>
+            </w:r>
+          </w:p>
+        </w:tc>
+        <w:tc>
+          <w:tcPr>
+            <w:tcW w:w="850" w:type="dxa"/>
+            <w:tcBorders>
+              <w:top w:val="nil" w:color="000000"/>
+              <w:left w:val="nil" w:color="000000"/>
+              <w:bottom w:val="nil" w:color="000000"/>
+              <w:right w:val="nil" w:color="000000"/>
+            </w:tcBorders>
+            <w:vAlign w:val="bottom"/>
+          </w:tcPr>
+          <w:p>
+            <w:pPr>
+              <w:spacing w:after="0"/>
+              <w:jc w:val="center"/>
+            </w:pPr>
+            <w:r>
+              <w:t xml:space="preserve">[-0.05,0.01]</w:t>
+            </w:r>
+          </w:p>
+        </w:tc>
+        <w:tc>
+          <w:tcPr>
+            <w:tcW w:w="850" w:type="dxa"/>
+            <w:tcBorders>
+              <w:top w:val="nil" w:color="000000"/>
+              <w:left w:val="nil" w:color="000000"/>
+              <w:bottom w:val="nil" w:color="000000"/>
+              <w:right w:val="nil" w:color="000000"/>
+            </w:tcBorders>
+            <w:vAlign w:val="bottom"/>
+          </w:tcPr>
+          <w:p>
+            <w:pPr>
+              <w:spacing w:after="0"/>
+              <w:jc w:val="center"/>
+            </w:pPr>
+            <w:r>
+              <w:t xml:space="preserve">[-0.06,0.01]</w:t>
+            </w:r>
+          </w:p>
+        </w:tc>
+        <w:tc>
+          <w:tcPr>
+            <w:tcW w:w="850" w:type="dxa"/>
             <w:tcBorders>
               <w:top w:val="nil" w:color="000000"/>
               <w:left w:val="nil" w:color="000000"/>
@@ -634,7 +2322,7 @@
       <w:tr>
         <w:tc>
           <w:tcPr>
-            <w:tcW w:w="3120" w:type="dxa"/>
+            <w:tcW w:w="850" w:type="dxa"/>
             <w:tcBorders>
               <w:top w:val="nil" w:color="000000"/>
               <w:left w:val="nil" w:color="000000"/>
@@ -655,7 +2343,7 @@
         </w:tc>
         <w:tc>
           <w:tcPr>
-            <w:tcW w:w="3120" w:type="dxa"/>
+            <w:tcW w:w="850" w:type="dxa"/>
             <w:tcBorders>
               <w:top w:val="nil" w:color="000000"/>
               <w:left w:val="single" w:color="000000"/>
@@ -676,7 +2364,7 @@
         </w:tc>
         <w:tc>
           <w:tcPr>
-            <w:tcW w:w="3120" w:type="dxa"/>
+            <w:tcW w:w="850" w:type="dxa"/>
             <w:tcBorders>
               <w:top w:val="nil" w:color="000000"/>
               <w:left w:val="nil" w:color="000000"/>
@@ -692,6 +2380,174 @@
             </w:pPr>
             <w:r>
               <w:t xml:space="preserve">-0.19***</w:t>
+            </w:r>
+          </w:p>
+        </w:tc>
+        <w:tc>
+          <w:tcPr>
+            <w:tcW w:w="850" w:type="dxa"/>
+            <w:tcBorders>
+              <w:top w:val="nil" w:color="000000"/>
+              <w:left w:val="nil" w:color="000000"/>
+              <w:bottom w:val="nil" w:color="000000"/>
+              <w:right w:val="nil" w:color="000000"/>
+            </w:tcBorders>
+            <w:vAlign w:val="bottom"/>
+          </w:tcPr>
+          <w:p>
+            <w:pPr>
+              <w:spacing w:after="0"/>
+              <w:jc w:val="center"/>
+            </w:pPr>
+            <w:r>
+              <w:t xml:space="preserve">-0.21***</w:t>
+            </w:r>
+          </w:p>
+        </w:tc>
+        <w:tc>
+          <w:tcPr>
+            <w:tcW w:w="850" w:type="dxa"/>
+            <w:tcBorders>
+              <w:top w:val="nil" w:color="000000"/>
+              <w:left w:val="nil" w:color="000000"/>
+              <w:bottom w:val="nil" w:color="000000"/>
+              <w:right w:val="nil" w:color="000000"/>
+            </w:tcBorders>
+            <w:vAlign w:val="bottom"/>
+          </w:tcPr>
+          <w:p>
+            <w:pPr>
+              <w:spacing w:after="0"/>
+              <w:jc w:val="center"/>
+            </w:pPr>
+            <w:r>
+              <w:t xml:space="preserve">-0.22***</w:t>
+            </w:r>
+          </w:p>
+        </w:tc>
+        <w:tc>
+          <w:tcPr>
+            <w:tcW w:w="850" w:type="dxa"/>
+            <w:tcBorders>
+              <w:top w:val="nil" w:color="000000"/>
+              <w:left w:val="nil" w:color="000000"/>
+              <w:bottom w:val="nil" w:color="000000"/>
+              <w:right w:val="nil" w:color="000000"/>
+            </w:tcBorders>
+            <w:vAlign w:val="bottom"/>
+          </w:tcPr>
+          <w:p>
+            <w:pPr>
+              <w:spacing w:after="0"/>
+              <w:jc w:val="center"/>
+            </w:pPr>
+            <w:r>
+              <w:t xml:space="preserve">-0.21***</w:t>
+            </w:r>
+          </w:p>
+        </w:tc>
+        <w:tc>
+          <w:tcPr>
+            <w:tcW w:w="850" w:type="dxa"/>
+            <w:tcBorders>
+              <w:top w:val="nil" w:color="000000"/>
+              <w:left w:val="nil" w:color="000000"/>
+              <w:bottom w:val="nil" w:color="000000"/>
+              <w:right w:val="nil" w:color="000000"/>
+            </w:tcBorders>
+            <w:vAlign w:val="bottom"/>
+          </w:tcPr>
+          <w:p>
+            <w:pPr>
+              <w:spacing w:after="0"/>
+              <w:jc w:val="center"/>
+            </w:pPr>
+            <w:r>
+              <w:t xml:space="preserve">-0.22***</w:t>
+            </w:r>
+          </w:p>
+        </w:tc>
+        <w:tc>
+          <w:tcPr>
+            <w:tcW w:w="850" w:type="dxa"/>
+            <w:tcBorders>
+              <w:top w:val="nil" w:color="000000"/>
+              <w:left w:val="nil" w:color="000000"/>
+              <w:bottom w:val="nil" w:color="000000"/>
+              <w:right w:val="nil" w:color="000000"/>
+            </w:tcBorders>
+            <w:vAlign w:val="bottom"/>
+          </w:tcPr>
+          <w:p>
+            <w:pPr>
+              <w:spacing w:after="0"/>
+              <w:jc w:val="center"/>
+            </w:pPr>
+            <w:r>
+              <w:t xml:space="preserve">-0.30***</w:t>
+            </w:r>
+          </w:p>
+        </w:tc>
+        <w:tc>
+          <w:tcPr>
+            <w:tcW w:w="850" w:type="dxa"/>
+            <w:tcBorders>
+              <w:top w:val="nil" w:color="000000"/>
+              <w:left w:val="nil" w:color="000000"/>
+              <w:bottom w:val="nil" w:color="000000"/>
+              <w:right w:val="nil" w:color="000000"/>
+            </w:tcBorders>
+            <w:vAlign w:val="bottom"/>
+          </w:tcPr>
+          <w:p>
+            <w:pPr>
+              <w:spacing w:after="0"/>
+              <w:jc w:val="center"/>
+            </w:pPr>
+            <w:r>
+              <w:t xml:space="preserve">-0.19***</w:t>
+            </w:r>
+          </w:p>
+        </w:tc>
+        <w:tc>
+          <w:tcPr>
+            <w:tcW w:w="850" w:type="dxa"/>
+            <w:tcBorders>
+              <w:top w:val="nil" w:color="000000"/>
+              <w:left w:val="nil" w:color="000000"/>
+              <w:bottom w:val="nil" w:color="000000"/>
+              <w:right w:val="nil" w:color="000000"/>
+            </w:tcBorders>
+            <w:vAlign w:val="bottom"/>
+          </w:tcPr>
+          <w:p>
+            <w:pPr>
+              <w:spacing w:after="0"/>
+              <w:jc w:val="center"/>
+            </w:pPr>
+            <w:r>
+              <w:t xml:space="preserve">-0.20***</w:t>
+            </w:r>
+          </w:p>
+        </w:tc>
+        <w:tc>
+          <w:tcPr>
+            <w:tcW w:w="850" w:type="dxa"/>
+            <w:tcBorders>
+              <w:top w:val="nil" w:color="000000"/>
+              <w:left w:val="nil" w:color="000000"/>
+              <w:bottom w:val="nil" w:color="000000"/>
+              <w:right w:val="nil" w:color="000000"/>
+            </w:tcBorders>
+            <w:vAlign w:val="bottom"/>
+          </w:tcPr>
+          <w:p>
+            <w:pPr>
+              <w:spacing w:after="0"/>
+              <w:jc w:val="center"/>
+            </w:pPr>
+            <w:r>
+              <w:t xml:space="preserve">-0.18***</w:t>
             </w:r>
           </w:p>
         </w:tc>
@@ -699,7 +2555,7 @@
       <w:tr>
         <w:tc>
           <w:tcPr>
-            <w:tcW w:w="3120" w:type="dxa"/>
+            <w:tcW w:w="850" w:type="dxa"/>
             <w:tcBorders>
               <w:top w:val="nil" w:color="000000"/>
               <w:left w:val="nil" w:color="000000"/>
@@ -715,7 +2571,7 @@
         </w:tc>
         <w:tc>
           <w:tcPr>
-            <w:tcW w:w="3120" w:type="dxa"/>
+            <w:tcW w:w="850" w:type="dxa"/>
             <w:tcBorders>
               <w:top w:val="nil" w:color="000000"/>
               <w:left w:val="single" w:color="000000"/>
@@ -736,7 +2592,7 @@
         </w:tc>
         <w:tc>
           <w:tcPr>
-            <w:tcW w:w="3120" w:type="dxa"/>
+            <w:tcW w:w="850" w:type="dxa"/>
             <w:tcBorders>
               <w:top w:val="nil" w:color="000000"/>
               <w:left w:val="nil" w:color="000000"/>
@@ -752,6 +2608,174 @@
             </w:pPr>
             <w:r>
               <w:t xml:space="preserve">[-0.31,-0.08]</w:t>
+            </w:r>
+          </w:p>
+        </w:tc>
+        <w:tc>
+          <w:tcPr>
+            <w:tcW w:w="850" w:type="dxa"/>
+            <w:tcBorders>
+              <w:top w:val="nil" w:color="000000"/>
+              <w:left w:val="nil" w:color="000000"/>
+              <w:bottom w:val="nil" w:color="000000"/>
+              <w:right w:val="nil" w:color="000000"/>
+            </w:tcBorders>
+            <w:vAlign w:val="bottom"/>
+          </w:tcPr>
+          <w:p>
+            <w:pPr>
+              <w:spacing w:after="0"/>
+              <w:jc w:val="center"/>
+            </w:pPr>
+            <w:r>
+              <w:t xml:space="preserve">[-0.32,-0.10]</w:t>
+            </w:r>
+          </w:p>
+        </w:tc>
+        <w:tc>
+          <w:tcPr>
+            <w:tcW w:w="850" w:type="dxa"/>
+            <w:tcBorders>
+              <w:top w:val="nil" w:color="000000"/>
+              <w:left w:val="nil" w:color="000000"/>
+              <w:bottom w:val="nil" w:color="000000"/>
+              <w:right w:val="nil" w:color="000000"/>
+            </w:tcBorders>
+            <w:vAlign w:val="bottom"/>
+          </w:tcPr>
+          <w:p>
+            <w:pPr>
+              <w:spacing w:after="0"/>
+              <w:jc w:val="center"/>
+            </w:pPr>
+            <w:r>
+              <w:t xml:space="preserve">[-0.34,-0.10]</w:t>
+            </w:r>
+          </w:p>
+        </w:tc>
+        <w:tc>
+          <w:tcPr>
+            <w:tcW w:w="850" w:type="dxa"/>
+            <w:tcBorders>
+              <w:top w:val="nil" w:color="000000"/>
+              <w:left w:val="nil" w:color="000000"/>
+              <w:bottom w:val="nil" w:color="000000"/>
+              <w:right w:val="nil" w:color="000000"/>
+            </w:tcBorders>
+            <w:vAlign w:val="bottom"/>
+          </w:tcPr>
+          <w:p>
+            <w:pPr>
+              <w:spacing w:after="0"/>
+              <w:jc w:val="center"/>
+            </w:pPr>
+            <w:r>
+              <w:t xml:space="preserve">[-0.32,-0.10]</w:t>
+            </w:r>
+          </w:p>
+        </w:tc>
+        <w:tc>
+          <w:tcPr>
+            <w:tcW w:w="850" w:type="dxa"/>
+            <w:tcBorders>
+              <w:top w:val="nil" w:color="000000"/>
+              <w:left w:val="nil" w:color="000000"/>
+              <w:bottom w:val="nil" w:color="000000"/>
+              <w:right w:val="nil" w:color="000000"/>
+            </w:tcBorders>
+            <w:vAlign w:val="bottom"/>
+          </w:tcPr>
+          <w:p>
+            <w:pPr>
+              <w:spacing w:after="0"/>
+              <w:jc w:val="center"/>
+            </w:pPr>
+            <w:r>
+              <w:t xml:space="preserve">[-0.33,-0.11]</w:t>
+            </w:r>
+          </w:p>
+        </w:tc>
+        <w:tc>
+          <w:tcPr>
+            <w:tcW w:w="850" w:type="dxa"/>
+            <w:tcBorders>
+              <w:top w:val="nil" w:color="000000"/>
+              <w:left w:val="nil" w:color="000000"/>
+              <w:bottom w:val="nil" w:color="000000"/>
+              <w:right w:val="nil" w:color="000000"/>
+            </w:tcBorders>
+            <w:vAlign w:val="bottom"/>
+          </w:tcPr>
+          <w:p>
+            <w:pPr>
+              <w:spacing w:after="0"/>
+              <w:jc w:val="center"/>
+            </w:pPr>
+            <w:r>
+              <w:t xml:space="preserve">[-0.43,-0.17]</w:t>
+            </w:r>
+          </w:p>
+        </w:tc>
+        <w:tc>
+          <w:tcPr>
+            <w:tcW w:w="850" w:type="dxa"/>
+            <w:tcBorders>
+              <w:top w:val="nil" w:color="000000"/>
+              <w:left w:val="nil" w:color="000000"/>
+              <w:bottom w:val="nil" w:color="000000"/>
+              <w:right w:val="nil" w:color="000000"/>
+            </w:tcBorders>
+            <w:vAlign w:val="bottom"/>
+          </w:tcPr>
+          <w:p>
+            <w:pPr>
+              <w:spacing w:after="0"/>
+              <w:jc w:val="center"/>
+            </w:pPr>
+            <w:r>
+              <w:t xml:space="preserve">[-0.31,-0.08]</w:t>
+            </w:r>
+          </w:p>
+        </w:tc>
+        <w:tc>
+          <w:tcPr>
+            <w:tcW w:w="850" w:type="dxa"/>
+            <w:tcBorders>
+              <w:top w:val="nil" w:color="000000"/>
+              <w:left w:val="nil" w:color="000000"/>
+              <w:bottom w:val="nil" w:color="000000"/>
+              <w:right w:val="nil" w:color="000000"/>
+            </w:tcBorders>
+            <w:vAlign w:val="bottom"/>
+          </w:tcPr>
+          <w:p>
+            <w:pPr>
+              <w:spacing w:after="0"/>
+              <w:jc w:val="center"/>
+            </w:pPr>
+            <w:r>
+              <w:t xml:space="preserve">[-0.31,-0.09]</w:t>
+            </w:r>
+          </w:p>
+        </w:tc>
+        <w:tc>
+          <w:tcPr>
+            <w:tcW w:w="850" w:type="dxa"/>
+            <w:tcBorders>
+              <w:top w:val="nil" w:color="000000"/>
+              <w:left w:val="nil" w:color="000000"/>
+              <w:bottom w:val="nil" w:color="000000"/>
+              <w:right w:val="nil" w:color="000000"/>
+            </w:tcBorders>
+            <w:vAlign w:val="bottom"/>
+          </w:tcPr>
+          <w:p>
+            <w:pPr>
+              <w:spacing w:after="0"/>
+              <w:jc w:val="center"/>
+            </w:pPr>
+            <w:r>
+              <w:t xml:space="preserve">[-0.29,-0.07]</w:t>
             </w:r>
           </w:p>
         </w:tc>
@@ -759,7 +2783,7 @@
       <w:tr>
         <w:tc>
           <w:tcPr>
-            <w:tcW w:w="3120" w:type="dxa"/>
+            <w:tcW w:w="850" w:type="dxa"/>
             <w:tcBorders>
               <w:top w:val="nil" w:color="000000"/>
               <w:left w:val="nil" w:color="000000"/>
@@ -780,7 +2804,7 @@
         </w:tc>
         <w:tc>
           <w:tcPr>
-            <w:tcW w:w="3120" w:type="dxa"/>
+            <w:tcW w:w="850" w:type="dxa"/>
             <w:tcBorders>
               <w:top w:val="nil" w:color="000000"/>
               <w:left w:val="single" w:color="000000"/>
@@ -796,7 +2820,135 @@
         </w:tc>
         <w:tc>
           <w:tcPr>
-            <w:tcW w:w="3120" w:type="dxa"/>
+            <w:tcW w:w="850" w:type="dxa"/>
+            <w:tcBorders>
+              <w:top w:val="nil" w:color="000000"/>
+              <w:left w:val="nil" w:color="000000"/>
+              <w:bottom w:val="nil" w:color="000000"/>
+              <w:right w:val="nil" w:color="000000"/>
+            </w:tcBorders>
+          </w:tcPr>
+          <w:p>
+            <w:pPr>
+              <w:spacing w:after="0"/>
+            </w:pPr>
+          </w:p>
+        </w:tc>
+        <w:tc>
+          <w:tcPr>
+            <w:tcW w:w="850" w:type="dxa"/>
+            <w:tcBorders>
+              <w:top w:val="nil" w:color="000000"/>
+              <w:left w:val="nil" w:color="000000"/>
+              <w:bottom w:val="nil" w:color="000000"/>
+              <w:right w:val="nil" w:color="000000"/>
+            </w:tcBorders>
+          </w:tcPr>
+          <w:p>
+            <w:pPr>
+              <w:spacing w:after="0"/>
+            </w:pPr>
+          </w:p>
+        </w:tc>
+        <w:tc>
+          <w:tcPr>
+            <w:tcW w:w="850" w:type="dxa"/>
+            <w:tcBorders>
+              <w:top w:val="nil" w:color="000000"/>
+              <w:left w:val="nil" w:color="000000"/>
+              <w:bottom w:val="nil" w:color="000000"/>
+              <w:right w:val="nil" w:color="000000"/>
+            </w:tcBorders>
+          </w:tcPr>
+          <w:p>
+            <w:pPr>
+              <w:spacing w:after="0"/>
+            </w:pPr>
+          </w:p>
+        </w:tc>
+        <w:tc>
+          <w:tcPr>
+            <w:tcW w:w="850" w:type="dxa"/>
+            <w:tcBorders>
+              <w:top w:val="nil" w:color="000000"/>
+              <w:left w:val="nil" w:color="000000"/>
+              <w:bottom w:val="nil" w:color="000000"/>
+              <w:right w:val="nil" w:color="000000"/>
+            </w:tcBorders>
+          </w:tcPr>
+          <w:p>
+            <w:pPr>
+              <w:spacing w:after="0"/>
+            </w:pPr>
+          </w:p>
+        </w:tc>
+        <w:tc>
+          <w:tcPr>
+            <w:tcW w:w="850" w:type="dxa"/>
+            <w:tcBorders>
+              <w:top w:val="nil" w:color="000000"/>
+              <w:left w:val="nil" w:color="000000"/>
+              <w:bottom w:val="nil" w:color="000000"/>
+              <w:right w:val="nil" w:color="000000"/>
+            </w:tcBorders>
+          </w:tcPr>
+          <w:p>
+            <w:pPr>
+              <w:spacing w:after="0"/>
+            </w:pPr>
+          </w:p>
+        </w:tc>
+        <w:tc>
+          <w:tcPr>
+            <w:tcW w:w="850" w:type="dxa"/>
+            <w:tcBorders>
+              <w:top w:val="nil" w:color="000000"/>
+              <w:left w:val="nil" w:color="000000"/>
+              <w:bottom w:val="nil" w:color="000000"/>
+              <w:right w:val="nil" w:color="000000"/>
+            </w:tcBorders>
+          </w:tcPr>
+          <w:p>
+            <w:pPr>
+              <w:spacing w:after="0"/>
+            </w:pPr>
+          </w:p>
+        </w:tc>
+        <w:tc>
+          <w:tcPr>
+            <w:tcW w:w="850" w:type="dxa"/>
+            <w:tcBorders>
+              <w:top w:val="nil" w:color="000000"/>
+              <w:left w:val="nil" w:color="000000"/>
+              <w:bottom w:val="nil" w:color="000000"/>
+              <w:right w:val="nil" w:color="000000"/>
+            </w:tcBorders>
+          </w:tcPr>
+          <w:p>
+            <w:pPr>
+              <w:spacing w:after="0"/>
+            </w:pPr>
+          </w:p>
+        </w:tc>
+        <w:tc>
+          <w:tcPr>
+            <w:tcW w:w="850" w:type="dxa"/>
+            <w:tcBorders>
+              <w:top w:val="nil" w:color="000000"/>
+              <w:left w:val="nil" w:color="000000"/>
+              <w:bottom w:val="nil" w:color="000000"/>
+              <w:right w:val="nil" w:color="000000"/>
+            </w:tcBorders>
+          </w:tcPr>
+          <w:p>
+            <w:pPr>
+              <w:spacing w:after="0"/>
+            </w:pPr>
+          </w:p>
+        </w:tc>
+        <w:tc>
+          <w:tcPr>
+            <w:tcW w:w="850" w:type="dxa"/>
             <w:tcBorders>
               <w:top w:val="nil" w:color="000000"/>
               <w:left w:val="nil" w:color="000000"/>
@@ -814,7 +2966,7 @@
       <w:tr>
         <w:tc>
           <w:tcPr>
-            <w:tcW w:w="3120" w:type="dxa"/>
+            <w:tcW w:w="850" w:type="dxa"/>
             <w:tcBorders>
               <w:top w:val="nil" w:color="000000"/>
               <w:left w:val="nil" w:color="000000"/>
@@ -835,7 +2987,7 @@
         </w:tc>
         <w:tc>
           <w:tcPr>
-            <w:tcW w:w="3120" w:type="dxa"/>
+            <w:tcW w:w="850" w:type="dxa"/>
             <w:tcBorders>
               <w:top w:val="nil" w:color="000000"/>
               <w:left w:val="single" w:color="000000"/>
@@ -856,7 +3008,7 @@
         </w:tc>
         <w:tc>
           <w:tcPr>
-            <w:tcW w:w="3120" w:type="dxa"/>
+            <w:tcW w:w="850" w:type="dxa"/>
             <w:tcBorders>
               <w:top w:val="nil" w:color="000000"/>
               <w:left w:val="nil" w:color="000000"/>
@@ -872,6 +3024,174 @@
             </w:pPr>
             <w:r>
               <w:t xml:space="preserve">-0.04</w:t>
+            </w:r>
+          </w:p>
+        </w:tc>
+        <w:tc>
+          <w:tcPr>
+            <w:tcW w:w="850" w:type="dxa"/>
+            <w:tcBorders>
+              <w:top w:val="nil" w:color="000000"/>
+              <w:left w:val="nil" w:color="000000"/>
+              <w:bottom w:val="nil" w:color="000000"/>
+              <w:right w:val="nil" w:color="000000"/>
+            </w:tcBorders>
+            <w:vAlign w:val="bottom"/>
+          </w:tcPr>
+          <w:p>
+            <w:pPr>
+              <w:spacing w:after="0"/>
+              <w:jc w:val="center"/>
+            </w:pPr>
+            <w:r>
+              <w:t xml:space="preserve">-0.05</w:t>
+            </w:r>
+          </w:p>
+        </w:tc>
+        <w:tc>
+          <w:tcPr>
+            <w:tcW w:w="850" w:type="dxa"/>
+            <w:tcBorders>
+              <w:top w:val="nil" w:color="000000"/>
+              <w:left w:val="nil" w:color="000000"/>
+              <w:bottom w:val="nil" w:color="000000"/>
+              <w:right w:val="nil" w:color="000000"/>
+            </w:tcBorders>
+            <w:vAlign w:val="bottom"/>
+          </w:tcPr>
+          <w:p>
+            <w:pPr>
+              <w:spacing w:after="0"/>
+              <w:jc w:val="center"/>
+            </w:pPr>
+            <w:r>
+              <w:t xml:space="preserve">-0.01</w:t>
+            </w:r>
+          </w:p>
+        </w:tc>
+        <w:tc>
+          <w:tcPr>
+            <w:tcW w:w="850" w:type="dxa"/>
+            <w:tcBorders>
+              <w:top w:val="nil" w:color="000000"/>
+              <w:left w:val="nil" w:color="000000"/>
+              <w:bottom w:val="nil" w:color="000000"/>
+              <w:right w:val="nil" w:color="000000"/>
+            </w:tcBorders>
+            <w:vAlign w:val="bottom"/>
+          </w:tcPr>
+          <w:p>
+            <w:pPr>
+              <w:spacing w:after="0"/>
+              <w:jc w:val="center"/>
+            </w:pPr>
+            <w:r>
+              <w:t xml:space="preserve">-0.03</w:t>
+            </w:r>
+          </w:p>
+        </w:tc>
+        <w:tc>
+          <w:tcPr>
+            <w:tcW w:w="850" w:type="dxa"/>
+            <w:tcBorders>
+              <w:top w:val="nil" w:color="000000"/>
+              <w:left w:val="nil" w:color="000000"/>
+              <w:bottom w:val="nil" w:color="000000"/>
+              <w:right w:val="nil" w:color="000000"/>
+            </w:tcBorders>
+            <w:vAlign w:val="bottom"/>
+          </w:tcPr>
+          <w:p>
+            <w:pPr>
+              <w:spacing w:after="0"/>
+              <w:jc w:val="center"/>
+            </w:pPr>
+            <w:r>
+              <w:t xml:space="preserve">-0.03</w:t>
+            </w:r>
+          </w:p>
+        </w:tc>
+        <w:tc>
+          <w:tcPr>
+            <w:tcW w:w="850" w:type="dxa"/>
+            <w:tcBorders>
+              <w:top w:val="nil" w:color="000000"/>
+              <w:left w:val="nil" w:color="000000"/>
+              <w:bottom w:val="nil" w:color="000000"/>
+              <w:right w:val="nil" w:color="000000"/>
+            </w:tcBorders>
+            <w:vAlign w:val="bottom"/>
+          </w:tcPr>
+          <w:p>
+            <w:pPr>
+              <w:spacing w:after="0"/>
+              <w:jc w:val="center"/>
+            </w:pPr>
+            <w:r>
+              <w:t xml:space="preserve">-0.10</w:t>
+            </w:r>
+          </w:p>
+        </w:tc>
+        <w:tc>
+          <w:tcPr>
+            <w:tcW w:w="850" w:type="dxa"/>
+            <w:tcBorders>
+              <w:top w:val="nil" w:color="000000"/>
+              <w:left w:val="nil" w:color="000000"/>
+              <w:bottom w:val="nil" w:color="000000"/>
+              <w:right w:val="nil" w:color="000000"/>
+            </w:tcBorders>
+            <w:vAlign w:val="bottom"/>
+          </w:tcPr>
+          <w:p>
+            <w:pPr>
+              <w:spacing w:after="0"/>
+              <w:jc w:val="center"/>
+            </w:pPr>
+            <w:r>
+              <w:t xml:space="preserve">-0.03</w:t>
+            </w:r>
+          </w:p>
+        </w:tc>
+        <w:tc>
+          <w:tcPr>
+            <w:tcW w:w="850" w:type="dxa"/>
+            <w:tcBorders>
+              <w:top w:val="nil" w:color="000000"/>
+              <w:left w:val="nil" w:color="000000"/>
+              <w:bottom w:val="nil" w:color="000000"/>
+              <w:right w:val="nil" w:color="000000"/>
+            </w:tcBorders>
+            <w:vAlign w:val="bottom"/>
+          </w:tcPr>
+          <w:p>
+            <w:pPr>
+              <w:spacing w:after="0"/>
+              <w:jc w:val="center"/>
+            </w:pPr>
+            <w:r>
+              <w:t xml:space="preserve">0.02</w:t>
+            </w:r>
+          </w:p>
+        </w:tc>
+        <w:tc>
+          <w:tcPr>
+            <w:tcW w:w="850" w:type="dxa"/>
+            <w:tcBorders>
+              <w:top w:val="nil" w:color="000000"/>
+              <w:left w:val="nil" w:color="000000"/>
+              <w:bottom w:val="nil" w:color="000000"/>
+              <w:right w:val="nil" w:color="000000"/>
+            </w:tcBorders>
+            <w:vAlign w:val="bottom"/>
+          </w:tcPr>
+          <w:p>
+            <w:pPr>
+              <w:spacing w:after="0"/>
+              <w:jc w:val="center"/>
+            </w:pPr>
+            <w:r>
+              <w:t xml:space="preserve">0.02</w:t>
             </w:r>
           </w:p>
         </w:tc>
@@ -879,7 +3199,7 @@
       <w:tr>
         <w:tc>
           <w:tcPr>
-            <w:tcW w:w="3120" w:type="dxa"/>
+            <w:tcW w:w="850" w:type="dxa"/>
             <w:tcBorders>
               <w:top w:val="nil" w:color="000000"/>
               <w:left w:val="nil" w:color="000000"/>
@@ -895,7 +3215,7 @@
         </w:tc>
         <w:tc>
           <w:tcPr>
-            <w:tcW w:w="3120" w:type="dxa"/>
+            <w:tcW w:w="850" w:type="dxa"/>
             <w:tcBorders>
               <w:top w:val="nil" w:color="000000"/>
               <w:left w:val="single" w:color="000000"/>
@@ -916,7 +3236,7 @@
         </w:tc>
         <w:tc>
           <w:tcPr>
-            <w:tcW w:w="3120" w:type="dxa"/>
+            <w:tcW w:w="850" w:type="dxa"/>
             <w:tcBorders>
               <w:top w:val="nil" w:color="000000"/>
               <w:left w:val="nil" w:color="000000"/>
@@ -932,6 +3252,174 @@
             </w:pPr>
             <w:r>
               <w:t xml:space="preserve">[-0.25,0.17]</w:t>
+            </w:r>
+          </w:p>
+        </w:tc>
+        <w:tc>
+          <w:tcPr>
+            <w:tcW w:w="850" w:type="dxa"/>
+            <w:tcBorders>
+              <w:top w:val="nil" w:color="000000"/>
+              <w:left w:val="nil" w:color="000000"/>
+              <w:bottom w:val="nil" w:color="000000"/>
+              <w:right w:val="nil" w:color="000000"/>
+            </w:tcBorders>
+            <w:vAlign w:val="bottom"/>
+          </w:tcPr>
+          <w:p>
+            <w:pPr>
+              <w:spacing w:after="0"/>
+              <w:jc w:val="center"/>
+            </w:pPr>
+            <w:r>
+              <w:t xml:space="preserve">[-0.26,0.16]</w:t>
+            </w:r>
+          </w:p>
+        </w:tc>
+        <w:tc>
+          <w:tcPr>
+            <w:tcW w:w="850" w:type="dxa"/>
+            <w:tcBorders>
+              <w:top w:val="nil" w:color="000000"/>
+              <w:left w:val="nil" w:color="000000"/>
+              <w:bottom w:val="nil" w:color="000000"/>
+              <w:right w:val="nil" w:color="000000"/>
+            </w:tcBorders>
+            <w:vAlign w:val="bottom"/>
+          </w:tcPr>
+          <w:p>
+            <w:pPr>
+              <w:spacing w:after="0"/>
+              <w:jc w:val="center"/>
+            </w:pPr>
+            <w:r>
+              <w:t xml:space="preserve">[-0.22,0.19]</w:t>
+            </w:r>
+          </w:p>
+        </w:tc>
+        <w:tc>
+          <w:tcPr>
+            <w:tcW w:w="850" w:type="dxa"/>
+            <w:tcBorders>
+              <w:top w:val="nil" w:color="000000"/>
+              <w:left w:val="nil" w:color="000000"/>
+              <w:bottom w:val="nil" w:color="000000"/>
+              <w:right w:val="nil" w:color="000000"/>
+            </w:tcBorders>
+            <w:vAlign w:val="bottom"/>
+          </w:tcPr>
+          <w:p>
+            <w:pPr>
+              <w:spacing w:after="0"/>
+              <w:jc w:val="center"/>
+            </w:pPr>
+            <w:r>
+              <w:t xml:space="preserve">[-0.24,0.18]</w:t>
+            </w:r>
+          </w:p>
+        </w:tc>
+        <w:tc>
+          <w:tcPr>
+            <w:tcW w:w="850" w:type="dxa"/>
+            <w:tcBorders>
+              <w:top w:val="nil" w:color="000000"/>
+              <w:left w:val="nil" w:color="000000"/>
+              <w:bottom w:val="nil" w:color="000000"/>
+              <w:right w:val="nil" w:color="000000"/>
+            </w:tcBorders>
+            <w:vAlign w:val="bottom"/>
+          </w:tcPr>
+          <w:p>
+            <w:pPr>
+              <w:spacing w:after="0"/>
+              <w:jc w:val="center"/>
+            </w:pPr>
+            <w:r>
+              <w:t xml:space="preserve">[-0.24,0.17]</w:t>
+            </w:r>
+          </w:p>
+        </w:tc>
+        <w:tc>
+          <w:tcPr>
+            <w:tcW w:w="850" w:type="dxa"/>
+            <w:tcBorders>
+              <w:top w:val="nil" w:color="000000"/>
+              <w:left w:val="nil" w:color="000000"/>
+              <w:bottom w:val="nil" w:color="000000"/>
+              <w:right w:val="nil" w:color="000000"/>
+            </w:tcBorders>
+            <w:vAlign w:val="bottom"/>
+          </w:tcPr>
+          <w:p>
+            <w:pPr>
+              <w:spacing w:after="0"/>
+              <w:jc w:val="center"/>
+            </w:pPr>
+            <w:r>
+              <w:t xml:space="preserve">[-0.38,0.18]</w:t>
+            </w:r>
+          </w:p>
+        </w:tc>
+        <w:tc>
+          <w:tcPr>
+            <w:tcW w:w="850" w:type="dxa"/>
+            <w:tcBorders>
+              <w:top w:val="nil" w:color="000000"/>
+              <w:left w:val="nil" w:color="000000"/>
+              <w:bottom w:val="nil" w:color="000000"/>
+              <w:right w:val="nil" w:color="000000"/>
+            </w:tcBorders>
+            <w:vAlign w:val="bottom"/>
+          </w:tcPr>
+          <w:p>
+            <w:pPr>
+              <w:spacing w:after="0"/>
+              <w:jc w:val="center"/>
+            </w:pPr>
+            <w:r>
+              <w:t xml:space="preserve">[-0.24,0.19]</w:t>
+            </w:r>
+          </w:p>
+        </w:tc>
+        <w:tc>
+          <w:tcPr>
+            <w:tcW w:w="850" w:type="dxa"/>
+            <w:tcBorders>
+              <w:top w:val="nil" w:color="000000"/>
+              <w:left w:val="nil" w:color="000000"/>
+              <w:bottom w:val="nil" w:color="000000"/>
+              <w:right w:val="nil" w:color="000000"/>
+            </w:tcBorders>
+            <w:vAlign w:val="bottom"/>
+          </w:tcPr>
+          <w:p>
+            <w:pPr>
+              <w:spacing w:after="0"/>
+              <w:jc w:val="center"/>
+            </w:pPr>
+            <w:r>
+              <w:t xml:space="preserve">[-0.16,0.19]</w:t>
+            </w:r>
+          </w:p>
+        </w:tc>
+        <w:tc>
+          <w:tcPr>
+            <w:tcW w:w="850" w:type="dxa"/>
+            <w:tcBorders>
+              <w:top w:val="nil" w:color="000000"/>
+              <w:left w:val="nil" w:color="000000"/>
+              <w:bottom w:val="nil" w:color="000000"/>
+              <w:right w:val="nil" w:color="000000"/>
+            </w:tcBorders>
+            <w:vAlign w:val="bottom"/>
+          </w:tcPr>
+          <w:p>
+            <w:pPr>
+              <w:spacing w:after="0"/>
+              <w:jc w:val="center"/>
+            </w:pPr>
+            <w:r>
+              <w:t xml:space="preserve">[-0.16,0.20]</w:t>
             </w:r>
           </w:p>
         </w:tc>
@@ -939,7 +3427,7 @@
       <w:tr>
         <w:tc>
           <w:tcPr>
-            <w:tcW w:w="3120" w:type="dxa"/>
+            <w:tcW w:w="850" w:type="dxa"/>
             <w:tcBorders>
               <w:top w:val="nil" w:color="000000"/>
               <w:left w:val="nil" w:color="000000"/>
@@ -960,7 +3448,7 @@
         </w:tc>
         <w:tc>
           <w:tcPr>
-            <w:tcW w:w="3120" w:type="dxa"/>
+            <w:tcW w:w="850" w:type="dxa"/>
             <w:tcBorders>
               <w:top w:val="nil" w:color="000000"/>
               <w:left w:val="single" w:color="000000"/>
@@ -981,7 +3469,7 @@
         </w:tc>
         <w:tc>
           <w:tcPr>
-            <w:tcW w:w="3120" w:type="dxa"/>
+            <w:tcW w:w="850" w:type="dxa"/>
             <w:tcBorders>
               <w:top w:val="nil" w:color="000000"/>
               <w:left w:val="nil" w:color="000000"/>
@@ -997,6 +3485,174 @@
             </w:pPr>
             <w:r>
               <w:t xml:space="preserve">2.27***</w:t>
+            </w:r>
+          </w:p>
+        </w:tc>
+        <w:tc>
+          <w:tcPr>
+            <w:tcW w:w="850" w:type="dxa"/>
+            <w:tcBorders>
+              <w:top w:val="nil" w:color="000000"/>
+              <w:left w:val="nil" w:color="000000"/>
+              <w:bottom w:val="nil" w:color="000000"/>
+              <w:right w:val="nil" w:color="000000"/>
+            </w:tcBorders>
+            <w:vAlign w:val="bottom"/>
+          </w:tcPr>
+          <w:p>
+            <w:pPr>
+              <w:spacing w:after="0"/>
+              <w:jc w:val="center"/>
+            </w:pPr>
+            <w:r>
+              <w:t xml:space="preserve">2.87***</w:t>
+            </w:r>
+          </w:p>
+        </w:tc>
+        <w:tc>
+          <w:tcPr>
+            <w:tcW w:w="850" w:type="dxa"/>
+            <w:tcBorders>
+              <w:top w:val="nil" w:color="000000"/>
+              <w:left w:val="nil" w:color="000000"/>
+              <w:bottom w:val="nil" w:color="000000"/>
+              <w:right w:val="nil" w:color="000000"/>
+            </w:tcBorders>
+            <w:vAlign w:val="bottom"/>
+          </w:tcPr>
+          <w:p>
+            <w:pPr>
+              <w:spacing w:after="0"/>
+              <w:jc w:val="center"/>
+            </w:pPr>
+            <w:r>
+              <w:t xml:space="preserve">1.79***</w:t>
+            </w:r>
+          </w:p>
+        </w:tc>
+        <w:tc>
+          <w:tcPr>
+            <w:tcW w:w="850" w:type="dxa"/>
+            <w:tcBorders>
+              <w:top w:val="nil" w:color="000000"/>
+              <w:left w:val="nil" w:color="000000"/>
+              <w:bottom w:val="nil" w:color="000000"/>
+              <w:right w:val="nil" w:color="000000"/>
+            </w:tcBorders>
+            <w:vAlign w:val="bottom"/>
+          </w:tcPr>
+          <w:p>
+            <w:pPr>
+              <w:spacing w:after="0"/>
+              <w:jc w:val="center"/>
+            </w:pPr>
+            <w:r>
+              <w:t xml:space="preserve">2.32***</w:t>
+            </w:r>
+          </w:p>
+        </w:tc>
+        <w:tc>
+          <w:tcPr>
+            <w:tcW w:w="850" w:type="dxa"/>
+            <w:tcBorders>
+              <w:top w:val="nil" w:color="000000"/>
+              <w:left w:val="nil" w:color="000000"/>
+              <w:bottom w:val="nil" w:color="000000"/>
+              <w:right w:val="nil" w:color="000000"/>
+            </w:tcBorders>
+            <w:vAlign w:val="bottom"/>
+          </w:tcPr>
+          <w:p>
+            <w:pPr>
+              <w:spacing w:after="0"/>
+              <w:jc w:val="center"/>
+            </w:pPr>
+            <w:r>
+              <w:t xml:space="preserve">2.34***</w:t>
+            </w:r>
+          </w:p>
+        </w:tc>
+        <w:tc>
+          <w:tcPr>
+            <w:tcW w:w="850" w:type="dxa"/>
+            <w:tcBorders>
+              <w:top w:val="nil" w:color="000000"/>
+              <w:left w:val="nil" w:color="000000"/>
+              <w:bottom w:val="nil" w:color="000000"/>
+              <w:right w:val="nil" w:color="000000"/>
+            </w:tcBorders>
+            <w:vAlign w:val="bottom"/>
+          </w:tcPr>
+          <w:p>
+            <w:pPr>
+              <w:spacing w:after="0"/>
+              <w:jc w:val="center"/>
+            </w:pPr>
+            <w:r>
+              <w:t xml:space="preserve">2.47***</w:t>
+            </w:r>
+          </w:p>
+        </w:tc>
+        <w:tc>
+          <w:tcPr>
+            <w:tcW w:w="850" w:type="dxa"/>
+            <w:tcBorders>
+              <w:top w:val="nil" w:color="000000"/>
+              <w:left w:val="nil" w:color="000000"/>
+              <w:bottom w:val="nil" w:color="000000"/>
+              <w:right w:val="nil" w:color="000000"/>
+            </w:tcBorders>
+            <w:vAlign w:val="bottom"/>
+          </w:tcPr>
+          <w:p>
+            <w:pPr>
+              <w:spacing w:after="0"/>
+              <w:jc w:val="center"/>
+            </w:pPr>
+            <w:r>
+              <w:t xml:space="preserve">2.12***</w:t>
+            </w:r>
+          </w:p>
+        </w:tc>
+        <w:tc>
+          <w:tcPr>
+            <w:tcW w:w="850" w:type="dxa"/>
+            <w:tcBorders>
+              <w:top w:val="nil" w:color="000000"/>
+              <w:left w:val="nil" w:color="000000"/>
+              <w:bottom w:val="nil" w:color="000000"/>
+              <w:right w:val="nil" w:color="000000"/>
+            </w:tcBorders>
+            <w:vAlign w:val="bottom"/>
+          </w:tcPr>
+          <w:p>
+            <w:pPr>
+              <w:spacing w:after="0"/>
+              <w:jc w:val="center"/>
+            </w:pPr>
+            <w:r>
+              <w:t xml:space="preserve">2.43***</w:t>
+            </w:r>
+          </w:p>
+        </w:tc>
+        <w:tc>
+          <w:tcPr>
+            <w:tcW w:w="850" w:type="dxa"/>
+            <w:tcBorders>
+              <w:top w:val="nil" w:color="000000"/>
+              <w:left w:val="nil" w:color="000000"/>
+              <w:bottom w:val="nil" w:color="000000"/>
+              <w:right w:val="nil" w:color="000000"/>
+            </w:tcBorders>
+            <w:vAlign w:val="bottom"/>
+          </w:tcPr>
+          <w:p>
+            <w:pPr>
+              <w:spacing w:after="0"/>
+              <w:jc w:val="center"/>
+            </w:pPr>
+            <w:r>
+              <w:t xml:space="preserve">2.30***</w:t>
             </w:r>
           </w:p>
         </w:tc>
@@ -1004,7 +3660,7 @@
       <w:tr>
         <w:tc>
           <w:tcPr>
-            <w:tcW w:w="3120" w:type="dxa"/>
+            <w:tcW w:w="850" w:type="dxa"/>
             <w:tcBorders>
               <w:top w:val="nil" w:color="000000"/>
               <w:left w:val="nil" w:color="000000"/>
@@ -1020,7 +3676,7 @@
         </w:tc>
         <w:tc>
           <w:tcPr>
-            <w:tcW w:w="3120" w:type="dxa"/>
+            <w:tcW w:w="850" w:type="dxa"/>
             <w:tcBorders>
               <w:top w:val="nil" w:color="000000"/>
               <w:left w:val="single" w:color="000000"/>
@@ -1041,7 +3697,7 @@
         </w:tc>
         <w:tc>
           <w:tcPr>
-            <w:tcW w:w="3120" w:type="dxa"/>
+            <w:tcW w:w="850" w:type="dxa"/>
             <w:tcBorders>
               <w:top w:val="nil" w:color="000000"/>
               <w:left w:val="nil" w:color="000000"/>
@@ -1057,6 +3713,174 @@
             </w:pPr>
             <w:r>
               <w:t xml:space="preserve">[1.11,3.42]</w:t>
+            </w:r>
+          </w:p>
+        </w:tc>
+        <w:tc>
+          <w:tcPr>
+            <w:tcW w:w="850" w:type="dxa"/>
+            <w:tcBorders>
+              <w:top w:val="nil" w:color="000000"/>
+              <w:left w:val="nil" w:color="000000"/>
+              <w:bottom w:val="nil" w:color="000000"/>
+              <w:right w:val="nil" w:color="000000"/>
+            </w:tcBorders>
+            <w:vAlign w:val="bottom"/>
+          </w:tcPr>
+          <w:p>
+            <w:pPr>
+              <w:spacing w:after="0"/>
+              <w:jc w:val="center"/>
+            </w:pPr>
+            <w:r>
+              <w:t xml:space="preserve">[1.78,3.96]</w:t>
+            </w:r>
+          </w:p>
+        </w:tc>
+        <w:tc>
+          <w:tcPr>
+            <w:tcW w:w="850" w:type="dxa"/>
+            <w:tcBorders>
+              <w:top w:val="nil" w:color="000000"/>
+              <w:left w:val="nil" w:color="000000"/>
+              <w:bottom w:val="nil" w:color="000000"/>
+              <w:right w:val="nil" w:color="000000"/>
+            </w:tcBorders>
+            <w:vAlign w:val="bottom"/>
+          </w:tcPr>
+          <w:p>
+            <w:pPr>
+              <w:spacing w:after="0"/>
+              <w:jc w:val="center"/>
+            </w:pPr>
+            <w:r>
+              <w:t xml:space="preserve">[0.51,3.07]</w:t>
+            </w:r>
+          </w:p>
+        </w:tc>
+        <w:tc>
+          <w:tcPr>
+            <w:tcW w:w="850" w:type="dxa"/>
+            <w:tcBorders>
+              <w:top w:val="nil" w:color="000000"/>
+              <w:left w:val="nil" w:color="000000"/>
+              <w:bottom w:val="nil" w:color="000000"/>
+              <w:right w:val="nil" w:color="000000"/>
+            </w:tcBorders>
+            <w:vAlign w:val="bottom"/>
+          </w:tcPr>
+          <w:p>
+            <w:pPr>
+              <w:spacing w:after="0"/>
+              <w:jc w:val="center"/>
+            </w:pPr>
+            <w:r>
+              <w:t xml:space="preserve">[1.21,3.44]</w:t>
+            </w:r>
+          </w:p>
+        </w:tc>
+        <w:tc>
+          <w:tcPr>
+            <w:tcW w:w="850" w:type="dxa"/>
+            <w:tcBorders>
+              <w:top w:val="nil" w:color="000000"/>
+              <w:left w:val="nil" w:color="000000"/>
+              <w:bottom w:val="nil" w:color="000000"/>
+              <w:right w:val="nil" w:color="000000"/>
+            </w:tcBorders>
+            <w:vAlign w:val="bottom"/>
+          </w:tcPr>
+          <w:p>
+            <w:pPr>
+              <w:spacing w:after="0"/>
+              <w:jc w:val="center"/>
+            </w:pPr>
+            <w:r>
+              <w:t xml:space="preserve">[1.22,3.46]</w:t>
+            </w:r>
+          </w:p>
+        </w:tc>
+        <w:tc>
+          <w:tcPr>
+            <w:tcW w:w="850" w:type="dxa"/>
+            <w:tcBorders>
+              <w:top w:val="nil" w:color="000000"/>
+              <w:left w:val="nil" w:color="000000"/>
+              <w:bottom w:val="nil" w:color="000000"/>
+              <w:right w:val="nil" w:color="000000"/>
+            </w:tcBorders>
+            <w:vAlign w:val="bottom"/>
+          </w:tcPr>
+          <w:p>
+            <w:pPr>
+              <w:spacing w:after="0"/>
+              <w:jc w:val="center"/>
+            </w:pPr>
+            <w:r>
+              <w:t xml:space="preserve">[1.31,3.63]</w:t>
+            </w:r>
+          </w:p>
+        </w:tc>
+        <w:tc>
+          <w:tcPr>
+            <w:tcW w:w="850" w:type="dxa"/>
+            <w:tcBorders>
+              <w:top w:val="nil" w:color="000000"/>
+              <w:left w:val="nil" w:color="000000"/>
+              <w:bottom w:val="nil" w:color="000000"/>
+              <w:right w:val="nil" w:color="000000"/>
+            </w:tcBorders>
+            <w:vAlign w:val="bottom"/>
+          </w:tcPr>
+          <w:p>
+            <w:pPr>
+              <w:spacing w:after="0"/>
+              <w:jc w:val="center"/>
+            </w:pPr>
+            <w:r>
+              <w:t xml:space="preserve">[0.94,3.30]</w:t>
+            </w:r>
+          </w:p>
+        </w:tc>
+        <w:tc>
+          <w:tcPr>
+            <w:tcW w:w="850" w:type="dxa"/>
+            <w:tcBorders>
+              <w:top w:val="nil" w:color="000000"/>
+              <w:left w:val="nil" w:color="000000"/>
+              <w:bottom w:val="nil" w:color="000000"/>
+              <w:right w:val="nil" w:color="000000"/>
+            </w:tcBorders>
+            <w:vAlign w:val="bottom"/>
+          </w:tcPr>
+          <w:p>
+            <w:pPr>
+              <w:spacing w:after="0"/>
+              <w:jc w:val="center"/>
+            </w:pPr>
+            <w:r>
+              <w:t xml:space="preserve">[1.29,3.57]</w:t>
+            </w:r>
+          </w:p>
+        </w:tc>
+        <w:tc>
+          <w:tcPr>
+            <w:tcW w:w="850" w:type="dxa"/>
+            <w:tcBorders>
+              <w:top w:val="nil" w:color="000000"/>
+              <w:left w:val="nil" w:color="000000"/>
+              <w:bottom w:val="nil" w:color="000000"/>
+              <w:right w:val="nil" w:color="000000"/>
+            </w:tcBorders>
+            <w:vAlign w:val="bottom"/>
+          </w:tcPr>
+          <w:p>
+            <w:pPr>
+              <w:spacing w:after="0"/>
+              <w:jc w:val="center"/>
+            </w:pPr>
+            <w:r>
+              <w:t xml:space="preserve">[1.11,3.50]</w:t>
             </w:r>
           </w:p>
         </w:tc>
@@ -1064,7 +3888,7 @@
       <w:tr>
         <w:tc>
           <w:tcPr>
-            <w:tcW w:w="3120" w:type="dxa"/>
+            <w:tcW w:w="850" w:type="dxa"/>
             <w:tcBorders>
               <w:top w:val="nil" w:color="000000"/>
               <w:left w:val="nil" w:color="000000"/>
@@ -1085,7 +3909,7 @@
         </w:tc>
         <w:tc>
           <w:tcPr>
-            <w:tcW w:w="3120" w:type="dxa"/>
+            <w:tcW w:w="850" w:type="dxa"/>
             <w:tcBorders>
               <w:top w:val="nil" w:color="000000"/>
               <w:left w:val="single" w:color="000000"/>
@@ -1106,7 +3930,7 @@
         </w:tc>
         <w:tc>
           <w:tcPr>
-            <w:tcW w:w="3120" w:type="dxa"/>
+            <w:tcW w:w="850" w:type="dxa"/>
             <w:tcBorders>
               <w:top w:val="nil" w:color="000000"/>
               <w:left w:val="nil" w:color="000000"/>
@@ -1122,6 +3946,174 @@
             </w:pPr>
             <w:r>
               <w:t xml:space="preserve">254</w:t>
+            </w:r>
+          </w:p>
+        </w:tc>
+        <w:tc>
+          <w:tcPr>
+            <w:tcW w:w="850" w:type="dxa"/>
+            <w:tcBorders>
+              <w:top w:val="nil" w:color="000000"/>
+              <w:left w:val="nil" w:color="000000"/>
+              <w:bottom w:val="nil" w:color="000000"/>
+              <w:right w:val="nil" w:color="000000"/>
+            </w:tcBorders>
+            <w:vAlign w:val="bottom"/>
+          </w:tcPr>
+          <w:p>
+            <w:pPr>
+              <w:spacing w:after="0"/>
+              <w:jc w:val="center"/>
+            </w:pPr>
+            <w:r>
+              <w:t xml:space="preserve">288</w:t>
+            </w:r>
+          </w:p>
+        </w:tc>
+        <w:tc>
+          <w:tcPr>
+            <w:tcW w:w="850" w:type="dxa"/>
+            <w:tcBorders>
+              <w:top w:val="nil" w:color="000000"/>
+              <w:left w:val="nil" w:color="000000"/>
+              <w:bottom w:val="nil" w:color="000000"/>
+              <w:right w:val="nil" w:color="000000"/>
+            </w:tcBorders>
+            <w:vAlign w:val="bottom"/>
+          </w:tcPr>
+          <w:p>
+            <w:pPr>
+              <w:spacing w:after="0"/>
+              <w:jc w:val="center"/>
+            </w:pPr>
+            <w:r>
+              <w:t xml:space="preserve">288</w:t>
+            </w:r>
+          </w:p>
+        </w:tc>
+        <w:tc>
+          <w:tcPr>
+            <w:tcW w:w="850" w:type="dxa"/>
+            <w:tcBorders>
+              <w:top w:val="nil" w:color="000000"/>
+              <w:left w:val="nil" w:color="000000"/>
+              <w:bottom w:val="nil" w:color="000000"/>
+              <w:right w:val="nil" w:color="000000"/>
+            </w:tcBorders>
+            <w:vAlign w:val="bottom"/>
+          </w:tcPr>
+          <w:p>
+            <w:pPr>
+              <w:spacing w:after="0"/>
+              <w:jc w:val="center"/>
+            </w:pPr>
+            <w:r>
+              <w:t xml:space="preserve">288</w:t>
+            </w:r>
+          </w:p>
+        </w:tc>
+        <w:tc>
+          <w:tcPr>
+            <w:tcW w:w="850" w:type="dxa"/>
+            <w:tcBorders>
+              <w:top w:val="nil" w:color="000000"/>
+              <w:left w:val="nil" w:color="000000"/>
+              <w:bottom w:val="nil" w:color="000000"/>
+              <w:right w:val="nil" w:color="000000"/>
+            </w:tcBorders>
+            <w:vAlign w:val="bottom"/>
+          </w:tcPr>
+          <w:p>
+            <w:pPr>
+              <w:spacing w:after="0"/>
+              <w:jc w:val="center"/>
+            </w:pPr>
+            <w:r>
+              <w:t xml:space="preserve">288</w:t>
+            </w:r>
+          </w:p>
+        </w:tc>
+        <w:tc>
+          <w:tcPr>
+            <w:tcW w:w="850" w:type="dxa"/>
+            <w:tcBorders>
+              <w:top w:val="nil" w:color="000000"/>
+              <w:left w:val="nil" w:color="000000"/>
+              <w:bottom w:val="nil" w:color="000000"/>
+              <w:right w:val="nil" w:color="000000"/>
+            </w:tcBorders>
+            <w:vAlign w:val="bottom"/>
+          </w:tcPr>
+          <w:p>
+            <w:pPr>
+              <w:spacing w:after="0"/>
+              <w:jc w:val="center"/>
+            </w:pPr>
+            <w:r>
+              <w:t xml:space="preserve">288</w:t>
+            </w:r>
+          </w:p>
+        </w:tc>
+        <w:tc>
+          <w:tcPr>
+            <w:tcW w:w="850" w:type="dxa"/>
+            <w:tcBorders>
+              <w:top w:val="nil" w:color="000000"/>
+              <w:left w:val="nil" w:color="000000"/>
+              <w:bottom w:val="nil" w:color="000000"/>
+              <w:right w:val="nil" w:color="000000"/>
+            </w:tcBorders>
+            <w:vAlign w:val="bottom"/>
+          </w:tcPr>
+          <w:p>
+            <w:pPr>
+              <w:spacing w:after="0"/>
+              <w:jc w:val="center"/>
+            </w:pPr>
+            <w:r>
+              <w:t xml:space="preserve">288</w:t>
+            </w:r>
+          </w:p>
+        </w:tc>
+        <w:tc>
+          <w:tcPr>
+            <w:tcW w:w="850" w:type="dxa"/>
+            <w:tcBorders>
+              <w:top w:val="nil" w:color="000000"/>
+              <w:left w:val="nil" w:color="000000"/>
+              <w:bottom w:val="nil" w:color="000000"/>
+              <w:right w:val="nil" w:color="000000"/>
+            </w:tcBorders>
+            <w:vAlign w:val="bottom"/>
+          </w:tcPr>
+          <w:p>
+            <w:pPr>
+              <w:spacing w:after="0"/>
+              <w:jc w:val="center"/>
+            </w:pPr>
+            <w:r>
+              <w:t xml:space="preserve">288</w:t>
+            </w:r>
+          </w:p>
+        </w:tc>
+        <w:tc>
+          <w:tcPr>
+            <w:tcW w:w="850" w:type="dxa"/>
+            <w:tcBorders>
+              <w:top w:val="nil" w:color="000000"/>
+              <w:left w:val="nil" w:color="000000"/>
+              <w:bottom w:val="nil" w:color="000000"/>
+              <w:right w:val="nil" w:color="000000"/>
+            </w:tcBorders>
+            <w:vAlign w:val="bottom"/>
+          </w:tcPr>
+          <w:p>
+            <w:pPr>
+              <w:spacing w:after="0"/>
+              <w:jc w:val="center"/>
+            </w:pPr>
+            <w:r>
+              <w:t xml:space="preserve">288</w:t>
             </w:r>
           </w:p>
         </w:tc>
@@ -1129,7 +4121,7 @@
       <w:tr>
         <w:tc>
           <w:tcPr>
-            <w:tcW w:w="3120" w:type="dxa"/>
+            <w:tcW w:w="850" w:type="dxa"/>
             <w:tcBorders>
               <w:top w:val="nil" w:color="000000"/>
               <w:left w:val="nil" w:color="000000"/>
@@ -1150,7 +4142,7 @@
         </w:tc>
         <w:tc>
           <w:tcPr>
-            <w:tcW w:w="3120" w:type="dxa"/>
+            <w:tcW w:w="850" w:type="dxa"/>
             <w:tcBorders>
               <w:top w:val="nil" w:color="000000"/>
               <w:left w:val="single" w:color="000000"/>
@@ -1171,7 +4163,7 @@
         </w:tc>
         <w:tc>
           <w:tcPr>
-            <w:tcW w:w="3120" w:type="dxa"/>
+            <w:tcW w:w="850" w:type="dxa"/>
             <w:tcBorders>
               <w:top w:val="nil" w:color="000000"/>
               <w:left w:val="nil" w:color="000000"/>
@@ -1187,6 +4179,174 @@
             </w:pPr>
             <w:r>
               <w:t xml:space="preserve">0.25</w:t>
+            </w:r>
+          </w:p>
+        </w:tc>
+        <w:tc>
+          <w:tcPr>
+            <w:tcW w:w="850" w:type="dxa"/>
+            <w:tcBorders>
+              <w:top w:val="nil" w:color="000000"/>
+              <w:left w:val="nil" w:color="000000"/>
+              <w:bottom w:val="nil" w:color="000000"/>
+              <w:right w:val="nil" w:color="000000"/>
+            </w:tcBorders>
+            <w:vAlign w:val="bottom"/>
+          </w:tcPr>
+          <w:p>
+            <w:pPr>
+              <w:spacing w:after="0"/>
+              <w:jc w:val="center"/>
+            </w:pPr>
+            <w:r>
+              <w:t xml:space="preserve">0.28</w:t>
+            </w:r>
+          </w:p>
+        </w:tc>
+        <w:tc>
+          <w:tcPr>
+            <w:tcW w:w="850" w:type="dxa"/>
+            <w:tcBorders>
+              <w:top w:val="nil" w:color="000000"/>
+              <w:left w:val="nil" w:color="000000"/>
+              <w:bottom w:val="nil" w:color="000000"/>
+              <w:right w:val="nil" w:color="000000"/>
+            </w:tcBorders>
+            <w:vAlign w:val="bottom"/>
+          </w:tcPr>
+          <w:p>
+            <w:pPr>
+              <w:spacing w:after="0"/>
+              <w:jc w:val="center"/>
+            </w:pPr>
+            <w:r>
+              <w:t xml:space="preserve">0.19</w:t>
+            </w:r>
+          </w:p>
+        </w:tc>
+        <w:tc>
+          <w:tcPr>
+            <w:tcW w:w="850" w:type="dxa"/>
+            <w:tcBorders>
+              <w:top w:val="nil" w:color="000000"/>
+              <w:left w:val="nil" w:color="000000"/>
+              <w:bottom w:val="nil" w:color="000000"/>
+              <w:right w:val="nil" w:color="000000"/>
+            </w:tcBorders>
+            <w:vAlign w:val="bottom"/>
+          </w:tcPr>
+          <w:p>
+            <w:pPr>
+              <w:spacing w:after="0"/>
+              <w:jc w:val="center"/>
+            </w:pPr>
+            <w:r>
+              <w:t xml:space="preserve">0.25</w:t>
+            </w:r>
+          </w:p>
+        </w:tc>
+        <w:tc>
+          <w:tcPr>
+            <w:tcW w:w="850" w:type="dxa"/>
+            <w:tcBorders>
+              <w:top w:val="nil" w:color="000000"/>
+              <w:left w:val="nil" w:color="000000"/>
+              <w:bottom w:val="nil" w:color="000000"/>
+              <w:right w:val="nil" w:color="000000"/>
+            </w:tcBorders>
+            <w:vAlign w:val="bottom"/>
+          </w:tcPr>
+          <w:p>
+            <w:pPr>
+              <w:spacing w:after="0"/>
+              <w:jc w:val="center"/>
+            </w:pPr>
+            <w:r>
+              <w:t xml:space="preserve">0.25</w:t>
+            </w:r>
+          </w:p>
+        </w:tc>
+        <w:tc>
+          <w:tcPr>
+            <w:tcW w:w="850" w:type="dxa"/>
+            <w:tcBorders>
+              <w:top w:val="nil" w:color="000000"/>
+              <w:left w:val="nil" w:color="000000"/>
+              <w:bottom w:val="nil" w:color="000000"/>
+              <w:right w:val="nil" w:color="000000"/>
+            </w:tcBorders>
+            <w:vAlign w:val="bottom"/>
+          </w:tcPr>
+          <w:p>
+            <w:pPr>
+              <w:spacing w:after="0"/>
+              <w:jc w:val="center"/>
+            </w:pPr>
+            <w:r>
+              <w:t xml:space="preserve">0.27</w:t>
+            </w:r>
+          </w:p>
+        </w:tc>
+        <w:tc>
+          <w:tcPr>
+            <w:tcW w:w="850" w:type="dxa"/>
+            <w:tcBorders>
+              <w:top w:val="nil" w:color="000000"/>
+              <w:left w:val="nil" w:color="000000"/>
+              <w:bottom w:val="nil" w:color="000000"/>
+              <w:right w:val="nil" w:color="000000"/>
+            </w:tcBorders>
+            <w:vAlign w:val="bottom"/>
+          </w:tcPr>
+          <w:p>
+            <w:pPr>
+              <w:spacing w:after="0"/>
+              <w:jc w:val="center"/>
+            </w:pPr>
+            <w:r>
+              <w:t xml:space="preserve">0.25</w:t>
+            </w:r>
+          </w:p>
+        </w:tc>
+        <w:tc>
+          <w:tcPr>
+            <w:tcW w:w="850" w:type="dxa"/>
+            <w:tcBorders>
+              <w:top w:val="nil" w:color="000000"/>
+              <w:left w:val="nil" w:color="000000"/>
+              <w:bottom w:val="nil" w:color="000000"/>
+              <w:right w:val="nil" w:color="000000"/>
+            </w:tcBorders>
+            <w:vAlign w:val="bottom"/>
+          </w:tcPr>
+          <w:p>
+            <w:pPr>
+              <w:spacing w:after="0"/>
+              <w:jc w:val="center"/>
+            </w:pPr>
+            <w:r>
+              <w:t xml:space="preserve">0.26</w:t>
+            </w:r>
+          </w:p>
+        </w:tc>
+        <w:tc>
+          <w:tcPr>
+            <w:tcW w:w="850" w:type="dxa"/>
+            <w:tcBorders>
+              <w:top w:val="nil" w:color="000000"/>
+              <w:left w:val="nil" w:color="000000"/>
+              <w:bottom w:val="nil" w:color="000000"/>
+              <w:right w:val="nil" w:color="000000"/>
+            </w:tcBorders>
+            <w:vAlign w:val="bottom"/>
+          </w:tcPr>
+          <w:p>
+            <w:pPr>
+              <w:spacing w:after="0"/>
+              <w:jc w:val="center"/>
+            </w:pPr>
+            <w:r>
+              <w:t xml:space="preserve">0.26</w:t>
             </w:r>
           </w:p>
         </w:tc>
@@ -1194,7 +4354,7 @@
       <w:tr>
         <w:tc>
           <w:tcPr>
-            <w:tcW w:w="3120" w:type="dxa"/>
+            <w:tcW w:w="850" w:type="dxa"/>
             <w:tcBorders>
               <w:top w:val="nil" w:color="000000"/>
               <w:left w:val="nil" w:color="000000"/>
@@ -1215,7 +4375,7 @@
         </w:tc>
         <w:tc>
           <w:tcPr>
-            <w:tcW w:w="3120" w:type="dxa"/>
+            <w:tcW w:w="850" w:type="dxa"/>
             <w:tcBorders>
               <w:top w:val="nil" w:color="000000"/>
               <w:left w:val="single" w:color="000000"/>
@@ -1236,7 +4396,7 @@
         </w:tc>
         <w:tc>
           <w:tcPr>
-            <w:tcW w:w="3120" w:type="dxa"/>
+            <w:tcW w:w="850" w:type="dxa"/>
             <w:tcBorders>
               <w:top w:val="nil" w:color="000000"/>
               <w:left w:val="nil" w:color="000000"/>
@@ -1252,6 +4412,174 @@
             </w:pPr>
             <w:r>
               <w:t xml:space="preserve">0.23</w:t>
+            </w:r>
+          </w:p>
+        </w:tc>
+        <w:tc>
+          <w:tcPr>
+            <w:tcW w:w="850" w:type="dxa"/>
+            <w:tcBorders>
+              <w:top w:val="nil" w:color="000000"/>
+              <w:left w:val="nil" w:color="000000"/>
+              <w:bottom w:val="single" w:color="000000"/>
+              <w:right w:val="nil" w:color="000000"/>
+            </w:tcBorders>
+            <w:vAlign w:val="bottom"/>
+          </w:tcPr>
+          <w:p>
+            <w:pPr>
+              <w:spacing w:after="0"/>
+              <w:jc w:val="center"/>
+            </w:pPr>
+            <w:r>
+              <w:t xml:space="preserve">0.27</w:t>
+            </w:r>
+          </w:p>
+        </w:tc>
+        <w:tc>
+          <w:tcPr>
+            <w:tcW w:w="850" w:type="dxa"/>
+            <w:tcBorders>
+              <w:top w:val="nil" w:color="000000"/>
+              <w:left w:val="nil" w:color="000000"/>
+              <w:bottom w:val="single" w:color="000000"/>
+              <w:right w:val="nil" w:color="000000"/>
+            </w:tcBorders>
+            <w:vAlign w:val="bottom"/>
+          </w:tcPr>
+          <w:p>
+            <w:pPr>
+              <w:spacing w:after="0"/>
+              <w:jc w:val="center"/>
+            </w:pPr>
+            <w:r>
+              <w:t xml:space="preserve">0.17</w:t>
+            </w:r>
+          </w:p>
+        </w:tc>
+        <w:tc>
+          <w:tcPr>
+            <w:tcW w:w="850" w:type="dxa"/>
+            <w:tcBorders>
+              <w:top w:val="nil" w:color="000000"/>
+              <w:left w:val="nil" w:color="000000"/>
+              <w:bottom w:val="single" w:color="000000"/>
+              <w:right w:val="nil" w:color="000000"/>
+            </w:tcBorders>
+            <w:vAlign w:val="bottom"/>
+          </w:tcPr>
+          <w:p>
+            <w:pPr>
+              <w:spacing w:after="0"/>
+              <w:jc w:val="center"/>
+            </w:pPr>
+            <w:r>
+              <w:t xml:space="preserve">0.23</w:t>
+            </w:r>
+          </w:p>
+        </w:tc>
+        <w:tc>
+          <w:tcPr>
+            <w:tcW w:w="850" w:type="dxa"/>
+            <w:tcBorders>
+              <w:top w:val="nil" w:color="000000"/>
+              <w:left w:val="nil" w:color="000000"/>
+              <w:bottom w:val="single" w:color="000000"/>
+              <w:right w:val="nil" w:color="000000"/>
+            </w:tcBorders>
+            <w:vAlign w:val="bottom"/>
+          </w:tcPr>
+          <w:p>
+            <w:pPr>
+              <w:spacing w:after="0"/>
+              <w:jc w:val="center"/>
+            </w:pPr>
+            <w:r>
+              <w:t xml:space="preserve">0.23</w:t>
+            </w:r>
+          </w:p>
+        </w:tc>
+        <w:tc>
+          <w:tcPr>
+            <w:tcW w:w="850" w:type="dxa"/>
+            <w:tcBorders>
+              <w:top w:val="nil" w:color="000000"/>
+              <w:left w:val="nil" w:color="000000"/>
+              <w:bottom w:val="single" w:color="000000"/>
+              <w:right w:val="nil" w:color="000000"/>
+            </w:tcBorders>
+            <w:vAlign w:val="bottom"/>
+          </w:tcPr>
+          <w:p>
+            <w:pPr>
+              <w:spacing w:after="0"/>
+              <w:jc w:val="center"/>
+            </w:pPr>
+            <w:r>
+              <w:t xml:space="preserve">0.26</w:t>
+            </w:r>
+          </w:p>
+        </w:tc>
+        <w:tc>
+          <w:tcPr>
+            <w:tcW w:w="850" w:type="dxa"/>
+            <w:tcBorders>
+              <w:top w:val="nil" w:color="000000"/>
+              <w:left w:val="nil" w:color="000000"/>
+              <w:bottom w:val="single" w:color="000000"/>
+              <w:right w:val="nil" w:color="000000"/>
+            </w:tcBorders>
+            <w:vAlign w:val="bottom"/>
+          </w:tcPr>
+          <w:p>
+            <w:pPr>
+              <w:spacing w:after="0"/>
+              <w:jc w:val="center"/>
+            </w:pPr>
+            <w:r>
+              <w:t xml:space="preserve">0.23</w:t>
+            </w:r>
+          </w:p>
+        </w:tc>
+        <w:tc>
+          <w:tcPr>
+            <w:tcW w:w="850" w:type="dxa"/>
+            <w:tcBorders>
+              <w:top w:val="nil" w:color="000000"/>
+              <w:left w:val="nil" w:color="000000"/>
+              <w:bottom w:val="single" w:color="000000"/>
+              <w:right w:val="nil" w:color="000000"/>
+            </w:tcBorders>
+            <w:vAlign w:val="bottom"/>
+          </w:tcPr>
+          <w:p>
+            <w:pPr>
+              <w:spacing w:after="0"/>
+              <w:jc w:val="center"/>
+            </w:pPr>
+            <w:r>
+              <w:t xml:space="preserve">0.24</w:t>
+            </w:r>
+          </w:p>
+        </w:tc>
+        <w:tc>
+          <w:tcPr>
+            <w:tcW w:w="850" w:type="dxa"/>
+            <w:tcBorders>
+              <w:top w:val="nil" w:color="000000"/>
+              <w:left w:val="nil" w:color="000000"/>
+              <w:bottom w:val="single" w:color="000000"/>
+              <w:right w:val="nil" w:color="000000"/>
+            </w:tcBorders>
+            <w:vAlign w:val="bottom"/>
+          </w:tcPr>
+          <w:p>
+            <w:pPr>
+              <w:spacing w:after="0"/>
+              <w:jc w:val="center"/>
+            </w:pPr>
+            <w:r>
+              <w:t xml:space="preserve">0.25</w:t>
             </w:r>
           </w:p>
         </w:tc>

</xml_diff>